<commit_message>
Changed MD-STGCN to PDR-STGCN
</commit_message>
<xml_diff>
--- a/docs/result.docx
+++ b/docs/result.docx
@@ -2102,7 +2102,7 @@
           </w:tcPr>
           <w:p>
             <w:r>
-              <w:t>MD-STGCN</w:t>
+              <w:t>PDR-STGCN</w:t>
             </w:r>
           </w:p>
         </w:tc>
@@ -2112,7 +2112,7 @@
           </w:tcPr>
           <w:p>
             <w:r>
-              <w:t>72.77</w:t>
+              <w:t>73.06</w:t>
             </w:r>
           </w:p>
         </w:tc>
@@ -2122,7 +2122,7 @@
           </w:tcPr>
           <w:p>
             <w:r>
-              <w:t>8.57</w:t>
+              <w:t>8.49</w:t>
             </w:r>
           </w:p>
         </w:tc>
@@ -2132,7 +2132,7 @@
           </w:tcPr>
           <w:p>
             <w:r>
-              <w:t>8.10</w:t>
+              <w:t>8.09</w:t>
             </w:r>
           </w:p>
         </w:tc>
@@ -2142,27 +2142,27 @@
           </w:tcPr>
           <w:p>
             <w:r>
-              <w:t>10.55</w:t>
-            </w:r>
-          </w:p>
-        </w:tc>
-        <w:tc>
-          <w:tcPr>
-            <w:tcW w:w="1390" w:type="dxa"/>
-          </w:tcPr>
-          <w:p>
-            <w:r>
-              <w:t>101,852</w:t>
-            </w:r>
-          </w:p>
-        </w:tc>
-        <w:tc>
-          <w:tcPr>
-            <w:tcW w:w="1390" w:type="dxa"/>
-          </w:tcPr>
-          <w:p>
-            <w:r>
-              <w:t>132,648</w:t>
+              <w:t>10.36</w:t>
+            </w:r>
+          </w:p>
+        </w:tc>
+        <w:tc>
+          <w:tcPr>
+            <w:tcW w:w="1390" w:type="dxa"/>
+          </w:tcPr>
+          <w:p>
+            <w:r>
+              <w:t>101,634</w:t>
+            </w:r>
+          </w:p>
+        </w:tc>
+        <w:tc>
+          <w:tcPr>
+            <w:tcW w:w="1390" w:type="dxa"/>
+          </w:tcPr>
+          <w:p>
+            <w:r>
+              <w:t>130,203</w:t>
             </w:r>
           </w:p>
         </w:tc>
@@ -2172,7 +2172,7 @@
           </w:tcPr>
           <w:p>
             <w:r>
-              <w:t>0.6684</w:t>
+              <w:t>0.6805</w:t>
             </w:r>
           </w:p>
         </w:tc>
@@ -2182,7 +2182,7 @@
           </w:tcPr>
           <w:p>
             <w:r>
-              <w:t>+37.94</w:t>
+              <w:t>+38.23</w:t>
             </w:r>
           </w:p>
         </w:tc>
@@ -2192,7 +2192,7 @@
           </w:tcPr>
           <w:p>
             <w:r>
-              <w:t>+12.33</w:t>
+              <w:t>+12.41</w:t>
             </w:r>
           </w:p>
         </w:tc>
@@ -2777,11 +2777,9 @@
             <w:tcW w:w="1496" w:type="dxa"/>
           </w:tcPr>
           <w:p>
-            <w:proofErr w:type="spellStart"/>
             <w:r>
               <w:t>Autoformer</w:t>
             </w:r>
-            <w:proofErr w:type="spellEnd"/>
           </w:p>
         </w:tc>
         <w:tc>
@@ -4877,7 +4875,7 @@
           </w:tcPr>
           <w:p>
             <w:r>
-              <w:t>MD-STGCN</w:t>
+              <w:t>PDR-STGCN</w:t>
             </w:r>
           </w:p>
         </w:tc>
@@ -5486,11 +5484,9 @@
             <w:tcW w:w="1496" w:type="dxa"/>
           </w:tcPr>
           <w:p>
-            <w:proofErr w:type="spellStart"/>
             <w:r>
               <w:t>Autoformer</w:t>
             </w:r>
-            <w:proofErr w:type="spellEnd"/>
           </w:p>
         </w:tc>
         <w:tc>
@@ -6364,7 +6360,6 @@
   <w:style w:type="character" w:default="1" w:styleId="DefaultParagraphFont">
     <w:name w:val="Default Paragraph Font"/>
     <w:uiPriority w:val="1"/>
-    <w:semiHidden/>
     <w:unhideWhenUsed/>
   </w:style>
   <w:style w:type="table" w:default="1" w:styleId="TableNormal">

</xml_diff>

<commit_message>
Optimized hardware for all models, standardize initial tuning
</commit_message>
<xml_diff>
--- a/docs/result.docx
+++ b/docs/result.docx
@@ -511,91 +511,55 @@
           <w:tcPr>
             <w:tcW w:w="1283" w:type="dxa"/>
           </w:tcPr>
-          <w:p>
-            <w:r>
-              <w:t>73.98</w:t>
-            </w:r>
-          </w:p>
+          <w:p/>
         </w:tc>
         <w:tc>
           <w:tcPr>
             <w:tcW w:w="1183" w:type="dxa"/>
           </w:tcPr>
-          <w:p>
-            <w:r>
-              <w:t>8.17</w:t>
-            </w:r>
-          </w:p>
+          <w:p/>
         </w:tc>
         <w:tc>
           <w:tcPr>
             <w:tcW w:w="1207" w:type="dxa"/>
           </w:tcPr>
-          <w:p>
-            <w:r>
-              <w:t>7.99</w:t>
-            </w:r>
-          </w:p>
+          <w:p/>
         </w:tc>
         <w:tc>
           <w:tcPr>
             <w:tcW w:w="1240" w:type="dxa"/>
           </w:tcPr>
-          <w:p>
-            <w:r>
-              <w:t>9.86</w:t>
-            </w:r>
-          </w:p>
-        </w:tc>
-        <w:tc>
-          <w:tcPr>
-            <w:tcW w:w="1390" w:type="dxa"/>
-          </w:tcPr>
-          <w:p>
-            <w:r>
-              <w:t>100,441</w:t>
-            </w:r>
-          </w:p>
-        </w:tc>
-        <w:tc>
-          <w:tcPr>
-            <w:tcW w:w="1390" w:type="dxa"/>
-          </w:tcPr>
-          <w:p>
-            <w:r>
-              <w:t>123,956</w:t>
-            </w:r>
-          </w:p>
+          <w:p/>
+        </w:tc>
+        <w:tc>
+          <w:tcPr>
+            <w:tcW w:w="1390" w:type="dxa"/>
+          </w:tcPr>
+          <w:p/>
+        </w:tc>
+        <w:tc>
+          <w:tcPr>
+            <w:tcW w:w="1390" w:type="dxa"/>
+          </w:tcPr>
+          <w:p/>
         </w:tc>
         <w:tc>
           <w:tcPr>
             <w:tcW w:w="1154" w:type="dxa"/>
           </w:tcPr>
-          <w:p>
-            <w:r>
-              <w:t>0.7104</w:t>
-            </w:r>
-          </w:p>
+          <w:p/>
         </w:tc>
         <w:tc>
           <w:tcPr>
             <w:tcW w:w="1545" w:type="dxa"/>
           </w:tcPr>
-          <w:p>
-            <w:r>
-              <w:t>+39.14</w:t>
-            </w:r>
-          </w:p>
+          <w:p/>
         </w:tc>
         <w:tc>
           <w:tcPr>
             <w:tcW w:w="2060" w:type="dxa"/>
           </w:tcPr>
-          <w:p>
-            <w:r>
-              <w:t>+12.73</w:t>
-            </w:r>
-          </w:p>
+          <w:p/>
         </w:tc>
       </w:tr>
       <w:tr>
@@ -613,91 +577,55 @@
           <w:tcPr>
             <w:tcW w:w="1283" w:type="dxa"/>
           </w:tcPr>
-          <w:p>
-            <w:r>
-              <w:t>73.85</w:t>
-            </w:r>
-          </w:p>
+          <w:p/>
         </w:tc>
         <w:tc>
           <w:tcPr>
             <w:tcW w:w="1183" w:type="dxa"/>
           </w:tcPr>
-          <w:p>
-            <w:r>
-              <w:t>8.20</w:t>
-            </w:r>
-          </w:p>
+          <w:p/>
         </w:tc>
         <w:tc>
           <w:tcPr>
             <w:tcW w:w="1207" w:type="dxa"/>
           </w:tcPr>
-          <w:p>
-            <w:r>
-              <w:t>8.04</w:t>
-            </w:r>
-          </w:p>
+          <w:p/>
         </w:tc>
         <w:tc>
           <w:tcPr>
             <w:tcW w:w="1240" w:type="dxa"/>
           </w:tcPr>
-          <w:p>
-            <w:r>
-              <w:t>9.91</w:t>
-            </w:r>
-          </w:p>
-        </w:tc>
-        <w:tc>
-          <w:tcPr>
-            <w:tcW w:w="1390" w:type="dxa"/>
-          </w:tcPr>
-          <w:p>
-            <w:r>
-              <w:t>101,027</w:t>
-            </w:r>
-          </w:p>
-        </w:tc>
-        <w:tc>
-          <w:tcPr>
-            <w:tcW w:w="1390" w:type="dxa"/>
-          </w:tcPr>
-          <w:p>
-            <w:r>
-              <w:t>124,557</w:t>
-            </w:r>
-          </w:p>
+          <w:p/>
+        </w:tc>
+        <w:tc>
+          <w:tcPr>
+            <w:tcW w:w="1390" w:type="dxa"/>
+          </w:tcPr>
+          <w:p/>
+        </w:tc>
+        <w:tc>
+          <w:tcPr>
+            <w:tcW w:w="1390" w:type="dxa"/>
+          </w:tcPr>
+          <w:p/>
         </w:tc>
         <w:tc>
           <w:tcPr>
             <w:tcW w:w="1154" w:type="dxa"/>
           </w:tcPr>
-          <w:p>
-            <w:r>
-              <w:t>0.7076</w:t>
-            </w:r>
-          </w:p>
+          <w:p/>
         </w:tc>
         <w:tc>
           <w:tcPr>
             <w:tcW w:w="1545" w:type="dxa"/>
           </w:tcPr>
-          <w:p>
-            <w:r>
-              <w:t>+39.02</w:t>
-            </w:r>
-          </w:p>
+          <w:p/>
         </w:tc>
         <w:tc>
           <w:tcPr>
             <w:tcW w:w="2060" w:type="dxa"/>
           </w:tcPr>
-          <w:p>
-            <w:r>
-              <w:t>+12.70</w:t>
-            </w:r>
-          </w:p>
+          <w:p/>
         </w:tc>
       </w:tr>
       <w:tr>
@@ -715,91 +643,55 @@
           <w:tcPr>
             <w:tcW w:w="1283" w:type="dxa"/>
           </w:tcPr>
-          <w:p>
-            <w:r>
-              <w:t>72.34</w:t>
-            </w:r>
-          </w:p>
+          <w:p/>
         </w:tc>
         <w:tc>
           <w:tcPr>
             <w:tcW w:w="1183" w:type="dxa"/>
           </w:tcPr>
-          <w:p>
-            <w:r>
-              <w:t>8.66</w:t>
-            </w:r>
-          </w:p>
+          <w:p/>
         </w:tc>
         <w:tc>
           <w:tcPr>
             <w:tcW w:w="1207" w:type="dxa"/>
           </w:tcPr>
-          <w:p>
-            <w:r>
-              <w:t>8.57</w:t>
-            </w:r>
-          </w:p>
+          <w:p/>
         </w:tc>
         <w:tc>
           <w:tcPr>
             <w:tcW w:w="1240" w:type="dxa"/>
           </w:tcPr>
-          <w:p>
-            <w:r>
-              <w:t>10.43</w:t>
-            </w:r>
-          </w:p>
-        </w:tc>
-        <w:tc>
-          <w:tcPr>
-            <w:tcW w:w="1390" w:type="dxa"/>
-          </w:tcPr>
-          <w:p>
-            <w:r>
-              <w:t>107,762</w:t>
-            </w:r>
-          </w:p>
-        </w:tc>
-        <w:tc>
-          <w:tcPr>
-            <w:tcW w:w="1390" w:type="dxa"/>
-          </w:tcPr>
-          <w:p>
-            <w:r>
-              <w:t>131,033</w:t>
-            </w:r>
-          </w:p>
+          <w:p/>
+        </w:tc>
+        <w:tc>
+          <w:tcPr>
+            <w:tcW w:w="1390" w:type="dxa"/>
+          </w:tcPr>
+          <w:p/>
+        </w:tc>
+        <w:tc>
+          <w:tcPr>
+            <w:tcW w:w="1390" w:type="dxa"/>
+          </w:tcPr>
+          <w:p/>
         </w:tc>
         <w:tc>
           <w:tcPr>
             <w:tcW w:w="1154" w:type="dxa"/>
           </w:tcPr>
-          <w:p>
-            <w:r>
-              <w:t>0.6764</w:t>
-            </w:r>
-          </w:p>
+          <w:p/>
         </w:tc>
         <w:tc>
           <w:tcPr>
             <w:tcW w:w="1545" w:type="dxa"/>
           </w:tcPr>
-          <w:p>
-            <w:r>
-              <w:t>+37.51</w:t>
-            </w:r>
-          </w:p>
+          <w:p/>
         </w:tc>
         <w:tc>
           <w:tcPr>
             <w:tcW w:w="2060" w:type="dxa"/>
           </w:tcPr>
-          <w:p>
-            <w:r>
-              <w:t>+12.24</w:t>
-            </w:r>
-          </w:p>
+          <w:p/>
         </w:tc>
       </w:tr>
       <w:tr>
@@ -817,91 +709,55 @@
           <w:tcPr>
             <w:tcW w:w="1283" w:type="dxa"/>
           </w:tcPr>
-          <w:p>
-            <w:r>
-              <w:t>72.75</w:t>
-            </w:r>
-          </w:p>
+          <w:p/>
         </w:tc>
         <w:tc>
           <w:tcPr>
             <w:tcW w:w="1183" w:type="dxa"/>
           </w:tcPr>
-          <w:p>
-            <w:r>
-              <w:t>8.59</w:t>
-            </w:r>
-          </w:p>
+          <w:p/>
         </w:tc>
         <w:tc>
           <w:tcPr>
             <w:tcW w:w="1207" w:type="dxa"/>
           </w:tcPr>
-          <w:p>
-            <w:r>
-              <w:t>8.36</w:t>
-            </w:r>
-          </w:p>
+          <w:p/>
         </w:tc>
         <w:tc>
           <w:tcPr>
             <w:tcW w:w="1240" w:type="dxa"/>
           </w:tcPr>
-          <w:p>
-            <w:r>
-              <w:t>10.30</w:t>
-            </w:r>
-          </w:p>
-        </w:tc>
-        <w:tc>
-          <w:tcPr>
-            <w:tcW w:w="1390" w:type="dxa"/>
-          </w:tcPr>
-          <w:p>
-            <w:r>
-              <w:t>105,084</w:t>
-            </w:r>
-          </w:p>
-        </w:tc>
-        <w:tc>
-          <w:tcPr>
-            <w:tcW w:w="1390" w:type="dxa"/>
-          </w:tcPr>
-          <w:p>
-            <w:r>
-              <w:t>129,454</w:t>
-            </w:r>
-          </w:p>
+          <w:p/>
+        </w:tc>
+        <w:tc>
+          <w:tcPr>
+            <w:tcW w:w="1390" w:type="dxa"/>
+          </w:tcPr>
+          <w:p/>
+        </w:tc>
+        <w:tc>
+          <w:tcPr>
+            <w:tcW w:w="1390" w:type="dxa"/>
+          </w:tcPr>
+          <w:p/>
         </w:tc>
         <w:tc>
           <w:tcPr>
             <w:tcW w:w="1154" w:type="dxa"/>
           </w:tcPr>
-          <w:p>
-            <w:r>
-              <w:t>0.6842</w:t>
-            </w:r>
-          </w:p>
+          <w:p/>
         </w:tc>
         <w:tc>
           <w:tcPr>
             <w:tcW w:w="1545" w:type="dxa"/>
           </w:tcPr>
-          <w:p>
-            <w:r>
-              <w:t>+37.92</w:t>
-            </w:r>
-          </w:p>
+          <w:p/>
         </w:tc>
         <w:tc>
           <w:tcPr>
             <w:tcW w:w="2060" w:type="dxa"/>
           </w:tcPr>
-          <w:p>
-            <w:r>
-              <w:t>+12.31</w:t>
-            </w:r>
-          </w:p>
+          <w:p/>
         </w:tc>
       </w:tr>
       <w:tr>
@@ -919,91 +775,55 @@
           <w:tcPr>
             <w:tcW w:w="1283" w:type="dxa"/>
           </w:tcPr>
-          <w:p>
-            <w:r>
-              <w:t>72.19</w:t>
-            </w:r>
-          </w:p>
+          <w:p/>
         </w:tc>
         <w:tc>
           <w:tcPr>
             <w:tcW w:w="1183" w:type="dxa"/>
           </w:tcPr>
-          <w:p>
-            <w:r>
-              <w:t>8.77</w:t>
-            </w:r>
-          </w:p>
+          <w:p/>
         </w:tc>
         <w:tc>
           <w:tcPr>
             <w:tcW w:w="1207" w:type="dxa"/>
           </w:tcPr>
-          <w:p>
-            <w:r>
-              <w:t>8.62</w:t>
-            </w:r>
-          </w:p>
+          <w:p/>
         </w:tc>
         <w:tc>
           <w:tcPr>
             <w:tcW w:w="1240" w:type="dxa"/>
           </w:tcPr>
-          <w:p>
-            <w:r>
-              <w:t>10.42</w:t>
-            </w:r>
-          </w:p>
-        </w:tc>
-        <w:tc>
-          <w:tcPr>
-            <w:tcW w:w="1390" w:type="dxa"/>
-          </w:tcPr>
-          <w:p>
-            <w:r>
-              <w:t>108,325</w:t>
-            </w:r>
-          </w:p>
-        </w:tc>
-        <w:tc>
-          <w:tcPr>
-            <w:tcW w:w="1390" w:type="dxa"/>
-          </w:tcPr>
-          <w:p>
-            <w:r>
-              <w:t>130,906</w:t>
-            </w:r>
-          </w:p>
+          <w:p/>
+        </w:tc>
+        <w:tc>
+          <w:tcPr>
+            <w:tcW w:w="1390" w:type="dxa"/>
+          </w:tcPr>
+          <w:p/>
+        </w:tc>
+        <w:tc>
+          <w:tcPr>
+            <w:tcW w:w="1390" w:type="dxa"/>
+          </w:tcPr>
+          <w:p/>
         </w:tc>
         <w:tc>
           <w:tcPr>
             <w:tcW w:w="1154" w:type="dxa"/>
           </w:tcPr>
-          <w:p>
-            <w:r>
-              <w:t>0.6770</w:t>
-            </w:r>
-          </w:p>
+          <w:p/>
         </w:tc>
         <w:tc>
           <w:tcPr>
             <w:tcW w:w="1545" w:type="dxa"/>
           </w:tcPr>
-          <w:p>
-            <w:r>
-              <w:t>+37.36</w:t>
-            </w:r>
-          </w:p>
+          <w:p/>
         </w:tc>
         <w:tc>
           <w:tcPr>
             <w:tcW w:w="2060" w:type="dxa"/>
           </w:tcPr>
-          <w:p>
-            <w:r>
-              <w:t>+12.13</w:t>
-            </w:r>
-          </w:p>
+          <w:p/>
         </w:tc>
       </w:tr>
       <w:tr>
@@ -1021,91 +841,55 @@
           <w:tcPr>
             <w:tcW w:w="1283" w:type="dxa"/>
           </w:tcPr>
-          <w:p>
-            <w:r>
-              <w:t>75.51</w:t>
-            </w:r>
-          </w:p>
+          <w:p/>
         </w:tc>
         <w:tc>
           <w:tcPr>
             <w:tcW w:w="1183" w:type="dxa"/>
           </w:tcPr>
-          <w:p>
-            <w:r>
-              <w:t>7.68</w:t>
-            </w:r>
-          </w:p>
+          <w:p/>
         </w:tc>
         <w:tc>
           <w:tcPr>
             <w:tcW w:w="1207" w:type="dxa"/>
           </w:tcPr>
-          <w:p>
-            <w:r>
-              <w:t>7.32</w:t>
-            </w:r>
-          </w:p>
+          <w:p/>
         </w:tc>
         <w:tc>
           <w:tcPr>
             <w:tcW w:w="1240" w:type="dxa"/>
           </w:tcPr>
-          <w:p>
-            <w:r>
-              <w:t>9.49</w:t>
-            </w:r>
-          </w:p>
-        </w:tc>
-        <w:tc>
-          <w:tcPr>
-            <w:tcW w:w="1390" w:type="dxa"/>
-          </w:tcPr>
-          <w:p>
-            <w:r>
-              <w:t>91,975</w:t>
-            </w:r>
-          </w:p>
-        </w:tc>
-        <w:tc>
-          <w:tcPr>
-            <w:tcW w:w="1390" w:type="dxa"/>
-          </w:tcPr>
-          <w:p>
-            <w:r>
-              <w:t>119,325</w:t>
-            </w:r>
-          </w:p>
+          <w:p/>
+        </w:tc>
+        <w:tc>
+          <w:tcPr>
+            <w:tcW w:w="1390" w:type="dxa"/>
+          </w:tcPr>
+          <w:p/>
+        </w:tc>
+        <w:tc>
+          <w:tcPr>
+            <w:tcW w:w="1390" w:type="dxa"/>
+          </w:tcPr>
+          <w:p/>
         </w:tc>
         <w:tc>
           <w:tcPr>
             <w:tcW w:w="1154" w:type="dxa"/>
           </w:tcPr>
-          <w:p>
-            <w:r>
-              <w:t>0.7317</w:t>
-            </w:r>
-          </w:p>
+          <w:p/>
         </w:tc>
         <w:tc>
           <w:tcPr>
             <w:tcW w:w="1545" w:type="dxa"/>
           </w:tcPr>
-          <w:p>
-            <w:r>
-              <w:t>+40.68</w:t>
-            </w:r>
-          </w:p>
+          <w:p/>
         </w:tc>
         <w:tc>
           <w:tcPr>
             <w:tcW w:w="2060" w:type="dxa"/>
           </w:tcPr>
-          <w:p>
-            <w:r>
-              <w:t>+13.22</w:t>
-            </w:r>
-          </w:p>
+          <w:p/>
         </w:tc>
       </w:tr>
       <w:tr>
@@ -1123,91 +907,55 @@
           <w:tcPr>
             <w:tcW w:w="1283" w:type="dxa"/>
           </w:tcPr>
-          <w:p>
-            <w:r>
-              <w:t>78.85</w:t>
-            </w:r>
-          </w:p>
+          <w:p/>
         </w:tc>
         <w:tc>
           <w:tcPr>
             <w:tcW w:w="1183" w:type="dxa"/>
           </w:tcPr>
-          <w:p>
-            <w:r>
-              <w:t>6.52</w:t>
-            </w:r>
-          </w:p>
+          <w:p/>
         </w:tc>
         <w:tc>
           <w:tcPr>
             <w:tcW w:w="1207" w:type="dxa"/>
           </w:tcPr>
-          <w:p>
-            <w:r>
-              <w:t>5.99</w:t>
-            </w:r>
-          </w:p>
+          <w:p/>
         </w:tc>
         <w:tc>
           <w:tcPr>
             <w:tcW w:w="1240" w:type="dxa"/>
           </w:tcPr>
-          <w:p>
-            <w:r>
-              <w:t>8.64</w:t>
-            </w:r>
-          </w:p>
-        </w:tc>
-        <w:tc>
-          <w:tcPr>
-            <w:tcW w:w="1390" w:type="dxa"/>
-          </w:tcPr>
-          <w:p>
-            <w:r>
-              <w:t>75,245</w:t>
-            </w:r>
-          </w:p>
-        </w:tc>
-        <w:tc>
-          <w:tcPr>
-            <w:tcW w:w="1390" w:type="dxa"/>
-          </w:tcPr>
-          <w:p>
-            <w:r>
-              <w:t>108,614</w:t>
-            </w:r>
-          </w:p>
+          <w:p/>
+        </w:tc>
+        <w:tc>
+          <w:tcPr>
+            <w:tcW w:w="1390" w:type="dxa"/>
+          </w:tcPr>
+          <w:p/>
+        </w:tc>
+        <w:tc>
+          <w:tcPr>
+            <w:tcW w:w="1390" w:type="dxa"/>
+          </w:tcPr>
+          <w:p/>
         </w:tc>
         <w:tc>
           <w:tcPr>
             <w:tcW w:w="1154" w:type="dxa"/>
           </w:tcPr>
-          <w:p>
-            <w:r>
-              <w:t>0.7777</w:t>
-            </w:r>
-          </w:p>
+          <w:p/>
         </w:tc>
         <w:tc>
           <w:tcPr>
             <w:tcW w:w="1545" w:type="dxa"/>
           </w:tcPr>
-          <w:p>
-            <w:r>
-              <w:t>+44.01</w:t>
-            </w:r>
-          </w:p>
+          <w:p/>
         </w:tc>
         <w:tc>
           <w:tcPr>
             <w:tcW w:w="2060" w:type="dxa"/>
           </w:tcPr>
-          <w:p>
-            <w:r>
-              <w:t>+14.37</w:t>
-            </w:r>
-          </w:p>
+          <w:p/>
         </w:tc>
       </w:tr>
     </w:tbl>
@@ -1702,91 +1450,55 @@
           <w:tcPr>
             <w:tcW w:w="1283" w:type="dxa"/>
           </w:tcPr>
-          <w:p>
-            <w:r>
-              <w:t>72.42</w:t>
-            </w:r>
-          </w:p>
+          <w:p/>
         </w:tc>
         <w:tc>
           <w:tcPr>
             <w:tcW w:w="1183" w:type="dxa"/>
           </w:tcPr>
-          <w:p>
-            <w:r>
-              <w:t>8.66</w:t>
-            </w:r>
-          </w:p>
+          <w:p/>
         </w:tc>
         <w:tc>
           <w:tcPr>
             <w:tcW w:w="1207" w:type="dxa"/>
           </w:tcPr>
-          <w:p>
-            <w:r>
-              <w:t>8.51</w:t>
-            </w:r>
-          </w:p>
+          <w:p/>
         </w:tc>
         <w:tc>
           <w:tcPr>
             <w:tcW w:w="1240" w:type="dxa"/>
           </w:tcPr>
-          <w:p>
-            <w:r>
-              <w:t>10.41</w:t>
-            </w:r>
-          </w:p>
-        </w:tc>
-        <w:tc>
-          <w:tcPr>
-            <w:tcW w:w="1390" w:type="dxa"/>
-          </w:tcPr>
-          <w:p>
-            <w:r>
-              <w:t>106,948</w:t>
-            </w:r>
-          </w:p>
-        </w:tc>
-        <w:tc>
-          <w:tcPr>
-            <w:tcW w:w="1390" w:type="dxa"/>
-          </w:tcPr>
-          <w:p>
-            <w:r>
-              <w:t>130,831</w:t>
-            </w:r>
-          </w:p>
+          <w:p/>
+        </w:tc>
+        <w:tc>
+          <w:tcPr>
+            <w:tcW w:w="1390" w:type="dxa"/>
+          </w:tcPr>
+          <w:p/>
+        </w:tc>
+        <w:tc>
+          <w:tcPr>
+            <w:tcW w:w="1390" w:type="dxa"/>
+          </w:tcPr>
+          <w:p/>
         </w:tc>
         <w:tc>
           <w:tcPr>
             <w:tcW w:w="1154" w:type="dxa"/>
           </w:tcPr>
-          <w:p>
-            <w:r>
-              <w:t>0.6774</w:t>
-            </w:r>
-          </w:p>
+          <w:p/>
         </w:tc>
         <w:tc>
           <w:tcPr>
             <w:tcW w:w="1545" w:type="dxa"/>
           </w:tcPr>
-          <w:p>
-            <w:r>
-              <w:t>+37.59</w:t>
-            </w:r>
-          </w:p>
+          <w:p/>
         </w:tc>
         <w:tc>
           <w:tcPr>
             <w:tcW w:w="2060" w:type="dxa"/>
           </w:tcPr>
-          <w:p>
-            <w:r>
-              <w:t>+12.24</w:t>
-            </w:r>
-          </w:p>
+          <w:p/>
         </w:tc>
       </w:tr>
       <w:tr>
@@ -1804,91 +1516,55 @@
           <w:tcPr>
             <w:tcW w:w="1283" w:type="dxa"/>
           </w:tcPr>
-          <w:p>
-            <w:r>
-              <w:t>65.42</w:t>
-            </w:r>
-          </w:p>
+          <w:p/>
         </w:tc>
         <w:tc>
           <w:tcPr>
             <w:tcW w:w="1183" w:type="dxa"/>
           </w:tcPr>
-          <w:p>
-            <w:r>
-              <w:t>11.56</w:t>
-            </w:r>
-          </w:p>
+          <w:p/>
         </w:tc>
         <w:tc>
           <w:tcPr>
             <w:tcW w:w="1207" w:type="dxa"/>
           </w:tcPr>
-          <w:p>
-            <w:r>
-              <w:t>9.92</w:t>
-            </w:r>
-          </w:p>
+          <w:p/>
         </w:tc>
         <w:tc>
           <w:tcPr>
             <w:tcW w:w="1240" w:type="dxa"/>
           </w:tcPr>
-          <w:p>
-            <w:r>
-              <w:t>13.10</w:t>
-            </w:r>
-          </w:p>
-        </w:tc>
-        <w:tc>
-          <w:tcPr>
-            <w:tcW w:w="1390" w:type="dxa"/>
-          </w:tcPr>
-          <w:p>
-            <w:r>
-              <w:t>124,629</w:t>
-            </w:r>
-          </w:p>
-        </w:tc>
-        <w:tc>
-          <w:tcPr>
-            <w:tcW w:w="1390" w:type="dxa"/>
-          </w:tcPr>
-          <w:p>
-            <w:r>
-              <w:t>164,608</w:t>
-            </w:r>
-          </w:p>
+          <w:p/>
+        </w:tc>
+        <w:tc>
+          <w:tcPr>
+            <w:tcW w:w="1390" w:type="dxa"/>
+          </w:tcPr>
+          <w:p/>
+        </w:tc>
+        <w:tc>
+          <w:tcPr>
+            <w:tcW w:w="1390" w:type="dxa"/>
+          </w:tcPr>
+          <w:p/>
         </w:tc>
         <w:tc>
           <w:tcPr>
             <w:tcW w:w="1154" w:type="dxa"/>
           </w:tcPr>
-          <w:p>
-            <w:r>
-              <w:t>0.4893</w:t>
-            </w:r>
-          </w:p>
+          <w:p/>
         </w:tc>
         <w:tc>
           <w:tcPr>
             <w:tcW w:w="1545" w:type="dxa"/>
           </w:tcPr>
-          <w:p>
-            <w:r>
-              <w:t>+30.59</w:t>
-            </w:r>
-          </w:p>
+          <w:p/>
         </w:tc>
         <w:tc>
           <w:tcPr>
             <w:tcW w:w="2060" w:type="dxa"/>
           </w:tcPr>
-          <w:p>
-            <w:r>
-              <w:t>+9.34</w:t>
-            </w:r>
-          </w:p>
+          <w:p/>
         </w:tc>
       </w:tr>
       <w:tr>
@@ -1906,91 +1582,55 @@
           <w:tcPr>
             <w:tcW w:w="1283" w:type="dxa"/>
           </w:tcPr>
-          <w:p>
-            <w:r>
-              <w:t>69.69</w:t>
-            </w:r>
-          </w:p>
+          <w:p/>
         </w:tc>
         <w:tc>
           <w:tcPr>
             <w:tcW w:w="1183" w:type="dxa"/>
           </w:tcPr>
-          <w:p>
-            <w:r>
-              <w:t>9.90</w:t>
-            </w:r>
-          </w:p>
+          <w:p/>
         </w:tc>
         <w:tc>
           <w:tcPr>
             <w:tcW w:w="1207" w:type="dxa"/>
           </w:tcPr>
-          <w:p>
-            <w:r>
-              <w:t>9.08</w:t>
-            </w:r>
-          </w:p>
+          <w:p/>
         </w:tc>
         <w:tc>
           <w:tcPr>
             <w:tcW w:w="1240" w:type="dxa"/>
           </w:tcPr>
-          <w:p>
-            <w:r>
-              <w:t>11.33</w:t>
-            </w:r>
-          </w:p>
-        </w:tc>
-        <w:tc>
-          <w:tcPr>
-            <w:tcW w:w="1390" w:type="dxa"/>
-          </w:tcPr>
-          <w:p>
-            <w:r>
-              <w:t>114,123</w:t>
-            </w:r>
-          </w:p>
-        </w:tc>
-        <w:tc>
-          <w:tcPr>
-            <w:tcW w:w="1390" w:type="dxa"/>
-          </w:tcPr>
-          <w:p>
-            <w:r>
-              <w:t>142,414</w:t>
-            </w:r>
-          </w:p>
+          <w:p/>
+        </w:tc>
+        <w:tc>
+          <w:tcPr>
+            <w:tcW w:w="1390" w:type="dxa"/>
+          </w:tcPr>
+          <w:p/>
+        </w:tc>
+        <w:tc>
+          <w:tcPr>
+            <w:tcW w:w="1390" w:type="dxa"/>
+          </w:tcPr>
+          <w:p/>
         </w:tc>
         <w:tc>
           <w:tcPr>
             <w:tcW w:w="1154" w:type="dxa"/>
           </w:tcPr>
-          <w:p>
-            <w:r>
-              <w:t>0.6178</w:t>
-            </w:r>
-          </w:p>
+          <w:p/>
         </w:tc>
         <w:tc>
           <w:tcPr>
             <w:tcW w:w="1545" w:type="dxa"/>
           </w:tcPr>
-          <w:p>
-            <w:r>
-              <w:t>+34.86</w:t>
-            </w:r>
-          </w:p>
+          <w:p/>
         </w:tc>
         <w:tc>
           <w:tcPr>
             <w:tcW w:w="2060" w:type="dxa"/>
           </w:tcPr>
-          <w:p>
-            <w:r>
-              <w:t>+11.00</w:t>
-            </w:r>
-          </w:p>
+          <w:p/>
         </w:tc>
       </w:tr>
       <w:tr>
@@ -2008,91 +1648,55 @@
           <w:tcPr>
             <w:tcW w:w="1283" w:type="dxa"/>
           </w:tcPr>
-          <w:p>
-            <w:r>
-              <w:t>75.55</w:t>
-            </w:r>
-          </w:p>
+          <w:p/>
         </w:tc>
         <w:tc>
           <w:tcPr>
             <w:tcW w:w="1183" w:type="dxa"/>
           </w:tcPr>
-          <w:p>
-            <w:r>
-              <w:t>7.69</w:t>
-            </w:r>
-          </w:p>
+          <w:p/>
         </w:tc>
         <w:tc>
           <w:tcPr>
             <w:tcW w:w="1207" w:type="dxa"/>
           </w:tcPr>
-          <w:p>
-            <w:r>
-              <w:t>7.09</w:t>
-            </w:r>
-          </w:p>
+          <w:p/>
         </w:tc>
         <w:tc>
           <w:tcPr>
             <w:tcW w:w="1240" w:type="dxa"/>
           </w:tcPr>
-          <w:p>
-            <w:r>
-              <w:t>9.67</w:t>
-            </w:r>
-          </w:p>
-        </w:tc>
-        <w:tc>
-          <w:tcPr>
-            <w:tcW w:w="1390" w:type="dxa"/>
-          </w:tcPr>
-          <w:p>
-            <w:r>
-              <w:t>89,085</w:t>
-            </w:r>
-          </w:p>
-        </w:tc>
-        <w:tc>
-          <w:tcPr>
-            <w:tcW w:w="1390" w:type="dxa"/>
-          </w:tcPr>
-          <w:p>
-            <w:r>
-              <w:t>121,531</w:t>
-            </w:r>
-          </w:p>
+          <w:p/>
+        </w:tc>
+        <w:tc>
+          <w:tcPr>
+            <w:tcW w:w="1390" w:type="dxa"/>
+          </w:tcPr>
+          <w:p/>
+        </w:tc>
+        <w:tc>
+          <w:tcPr>
+            <w:tcW w:w="1390" w:type="dxa"/>
+          </w:tcPr>
+          <w:p/>
         </w:tc>
         <w:tc>
           <w:tcPr>
             <w:tcW w:w="1154" w:type="dxa"/>
           </w:tcPr>
-          <w:p>
-            <w:r>
-              <w:t>0.7216</w:t>
-            </w:r>
-          </w:p>
+          <w:p/>
         </w:tc>
         <w:tc>
           <w:tcPr>
             <w:tcW w:w="1545" w:type="dxa"/>
           </w:tcPr>
-          <w:p>
-            <w:r>
-              <w:t>+40.72</w:t>
-            </w:r>
-          </w:p>
+          <w:p/>
         </w:tc>
         <w:tc>
           <w:tcPr>
             <w:tcW w:w="2060" w:type="dxa"/>
           </w:tcPr>
-          <w:p>
-            <w:r>
-              <w:t>+13.21</w:t>
-            </w:r>
-          </w:p>
+          <w:p/>
         </w:tc>
       </w:tr>
       <w:tr>
@@ -2110,91 +1714,55 @@
           <w:tcPr>
             <w:tcW w:w="1283" w:type="dxa"/>
           </w:tcPr>
-          <w:p>
-            <w:r>
-              <w:t>73.06</w:t>
-            </w:r>
-          </w:p>
+          <w:p/>
         </w:tc>
         <w:tc>
           <w:tcPr>
             <w:tcW w:w="1183" w:type="dxa"/>
           </w:tcPr>
-          <w:p>
-            <w:r>
-              <w:t>8.49</w:t>
-            </w:r>
-          </w:p>
+          <w:p/>
         </w:tc>
         <w:tc>
           <w:tcPr>
             <w:tcW w:w="1207" w:type="dxa"/>
           </w:tcPr>
-          <w:p>
-            <w:r>
-              <w:t>8.09</w:t>
-            </w:r>
-          </w:p>
+          <w:p/>
         </w:tc>
         <w:tc>
           <w:tcPr>
             <w:tcW w:w="1240" w:type="dxa"/>
           </w:tcPr>
-          <w:p>
-            <w:r>
-              <w:t>10.36</w:t>
-            </w:r>
-          </w:p>
-        </w:tc>
-        <w:tc>
-          <w:tcPr>
-            <w:tcW w:w="1390" w:type="dxa"/>
-          </w:tcPr>
-          <w:p>
-            <w:r>
-              <w:t>101,634</w:t>
-            </w:r>
-          </w:p>
-        </w:tc>
-        <w:tc>
-          <w:tcPr>
-            <w:tcW w:w="1390" w:type="dxa"/>
-          </w:tcPr>
-          <w:p>
-            <w:r>
-              <w:t>130,203</w:t>
-            </w:r>
-          </w:p>
+          <w:p/>
+        </w:tc>
+        <w:tc>
+          <w:tcPr>
+            <w:tcW w:w="1390" w:type="dxa"/>
+          </w:tcPr>
+          <w:p/>
+        </w:tc>
+        <w:tc>
+          <w:tcPr>
+            <w:tcW w:w="1390" w:type="dxa"/>
+          </w:tcPr>
+          <w:p/>
         </w:tc>
         <w:tc>
           <w:tcPr>
             <w:tcW w:w="1154" w:type="dxa"/>
           </w:tcPr>
-          <w:p>
-            <w:r>
-              <w:t>0.6805</w:t>
-            </w:r>
-          </w:p>
+          <w:p/>
         </w:tc>
         <w:tc>
           <w:tcPr>
             <w:tcW w:w="1545" w:type="dxa"/>
           </w:tcPr>
-          <w:p>
-            <w:r>
-              <w:t>+38.23</w:t>
-            </w:r>
-          </w:p>
+          <w:p/>
         </w:tc>
         <w:tc>
           <w:tcPr>
             <w:tcW w:w="2060" w:type="dxa"/>
           </w:tcPr>
-          <w:p>
-            <w:r>
-              <w:t>+12.41</w:t>
-            </w:r>
-          </w:p>
+          <w:p/>
         </w:tc>
       </w:tr>
     </w:tbl>
@@ -2684,91 +2252,55 @@
           <w:tcPr>
             <w:tcW w:w="1283" w:type="dxa"/>
           </w:tcPr>
-          <w:p>
-            <w:r>
-              <w:t>73.57</w:t>
-            </w:r>
-          </w:p>
+          <w:p/>
         </w:tc>
         <w:tc>
           <w:tcPr>
             <w:tcW w:w="1183" w:type="dxa"/>
           </w:tcPr>
-          <w:p>
-            <w:r>
-              <w:t>8.16</w:t>
-            </w:r>
-          </w:p>
+          <w:p/>
         </w:tc>
         <w:tc>
           <w:tcPr>
             <w:tcW w:w="1207" w:type="dxa"/>
           </w:tcPr>
-          <w:p>
-            <w:r>
-              <w:t>7.70</w:t>
-            </w:r>
-          </w:p>
+          <w:p/>
         </w:tc>
         <w:tc>
           <w:tcPr>
             <w:tcW w:w="1240" w:type="dxa"/>
           </w:tcPr>
-          <w:p>
-            <w:r>
-              <w:t>10.57</w:t>
-            </w:r>
-          </w:p>
-        </w:tc>
-        <w:tc>
-          <w:tcPr>
-            <w:tcW w:w="1390" w:type="dxa"/>
-          </w:tcPr>
-          <w:p>
-            <w:r>
-              <w:t>101,852</w:t>
-            </w:r>
-          </w:p>
-        </w:tc>
-        <w:tc>
-          <w:tcPr>
-            <w:tcW w:w="1390" w:type="dxa"/>
-          </w:tcPr>
-          <w:p>
-            <w:r>
-              <w:t>132,648</w:t>
-            </w:r>
-          </w:p>
+          <w:p/>
+        </w:tc>
+        <w:tc>
+          <w:tcPr>
+            <w:tcW w:w="1390" w:type="dxa"/>
+          </w:tcPr>
+          <w:p/>
+        </w:tc>
+        <w:tc>
+          <w:tcPr>
+            <w:tcW w:w="1390" w:type="dxa"/>
+          </w:tcPr>
+          <w:p/>
         </w:tc>
         <w:tc>
           <w:tcPr>
             <w:tcW w:w="1154" w:type="dxa"/>
           </w:tcPr>
-          <w:p>
-            <w:r>
-              <w:t>0.6675</w:t>
-            </w:r>
-          </w:p>
+          <w:p/>
         </w:tc>
         <w:tc>
           <w:tcPr>
             <w:tcW w:w="1545" w:type="dxa"/>
           </w:tcPr>
-          <w:p>
-            <w:r>
-              <w:t>+38.74</w:t>
-            </w:r>
-          </w:p>
+          <w:p/>
         </w:tc>
         <w:tc>
           <w:tcPr>
             <w:tcW w:w="2060" w:type="dxa"/>
           </w:tcPr>
-          <w:p>
-            <w:r>
-              <w:t>+12.74</w:t>
-            </w:r>
-          </w:p>
+          <w:p/>
         </w:tc>
       </w:tr>
       <w:tr>
@@ -2786,98 +2318,61 @@
           <w:tcPr>
             <w:tcW w:w="1283" w:type="dxa"/>
           </w:tcPr>
-          <w:p>
-            <w:r>
-              <w:t>77.98</w:t>
-            </w:r>
-          </w:p>
+          <w:p/>
         </w:tc>
         <w:tc>
           <w:tcPr>
             <w:tcW w:w="1183" w:type="dxa"/>
           </w:tcPr>
-          <w:p>
-            <w:r>
-              <w:t>6.73</w:t>
-            </w:r>
-          </w:p>
+          <w:p/>
         </w:tc>
         <w:tc>
           <w:tcPr>
             <w:tcW w:w="1207" w:type="dxa"/>
           </w:tcPr>
-          <w:p>
-            <w:r>
-              <w:t>6.14</w:t>
-            </w:r>
-          </w:p>
+          <w:p/>
         </w:tc>
         <w:tc>
           <w:tcPr>
             <w:tcW w:w="1240" w:type="dxa"/>
           </w:tcPr>
-          <w:p>
-            <w:r>
-              <w:t>9.15</w:t>
-            </w:r>
-          </w:p>
-        </w:tc>
-        <w:tc>
-          <w:tcPr>
-            <w:tcW w:w="1390" w:type="dxa"/>
-          </w:tcPr>
-          <w:p>
-            <w:r>
-              <w:t>77,150</w:t>
-            </w:r>
-          </w:p>
-        </w:tc>
-        <w:tc>
-          <w:tcPr>
-            <w:tcW w:w="1390" w:type="dxa"/>
-          </w:tcPr>
-          <w:p>
-            <w:r>
-              <w:t>115,026</w:t>
-            </w:r>
-          </w:p>
+          <w:p/>
+        </w:tc>
+        <w:tc>
+          <w:tcPr>
+            <w:tcW w:w="1390" w:type="dxa"/>
+          </w:tcPr>
+          <w:p/>
+        </w:tc>
+        <w:tc>
+          <w:tcPr>
+            <w:tcW w:w="1390" w:type="dxa"/>
+          </w:tcPr>
+          <w:p/>
         </w:tc>
         <w:tc>
           <w:tcPr>
             <w:tcW w:w="1154" w:type="dxa"/>
           </w:tcPr>
-          <w:p>
-            <w:r>
-              <w:t>0.7506</w:t>
-            </w:r>
-          </w:p>
+          <w:p/>
         </w:tc>
         <w:tc>
           <w:tcPr>
             <w:tcW w:w="1545" w:type="dxa"/>
           </w:tcPr>
-          <w:p>
-            <w:r>
-              <w:t>+43.15</w:t>
-            </w:r>
-          </w:p>
+          <w:p/>
         </w:tc>
         <w:tc>
           <w:tcPr>
             <w:tcW w:w="2060" w:type="dxa"/>
           </w:tcPr>
-          <w:p>
-            <w:r>
-              <w:t>+14.17</w:t>
-            </w:r>
-          </w:p>
+          <w:p/>
         </w:tc>
       </w:tr>
       <w:tr>
         <w:tc>
           <w:tcPr>
             <w:tcW w:w="1496" w:type="dxa"/>
-            <w:shd w:val="clear" w:color="auto" w:fill="B3E5A1" w:themeFill="accent6" w:themeFillTint="66"/>
           </w:tcPr>
           <w:p>
             <w:r>
@@ -2889,91 +2384,55 @@
           <w:tcPr>
             <w:tcW w:w="1283" w:type="dxa"/>
           </w:tcPr>
-          <w:p>
-            <w:r>
-              <w:t>80.20</w:t>
-            </w:r>
-          </w:p>
+          <w:p/>
         </w:tc>
         <w:tc>
           <w:tcPr>
             <w:tcW w:w="1183" w:type="dxa"/>
           </w:tcPr>
-          <w:p>
-            <w:r>
-              <w:t>6.12</w:t>
-            </w:r>
-          </w:p>
+          <w:p/>
         </w:tc>
         <w:tc>
           <w:tcPr>
             <w:tcW w:w="1207" w:type="dxa"/>
           </w:tcPr>
-          <w:p>
-            <w:r>
-              <w:t>5.20</w:t>
-            </w:r>
-          </w:p>
+          <w:p/>
         </w:tc>
         <w:tc>
           <w:tcPr>
             <w:tcW w:w="1240" w:type="dxa"/>
           </w:tcPr>
-          <w:p>
-            <w:r>
-              <w:t>8.47</w:t>
-            </w:r>
-          </w:p>
-        </w:tc>
-        <w:tc>
-          <w:tcPr>
-            <w:tcW w:w="1390" w:type="dxa"/>
-          </w:tcPr>
-          <w:p>
-            <w:r>
-              <w:t>65,140</w:t>
-            </w:r>
-          </w:p>
-        </w:tc>
-        <w:tc>
-          <w:tcPr>
-            <w:tcW w:w="1390" w:type="dxa"/>
-          </w:tcPr>
-          <w:p>
-            <w:r>
-              <w:t>106,444</w:t>
-            </w:r>
-          </w:p>
+          <w:p/>
+        </w:tc>
+        <w:tc>
+          <w:tcPr>
+            <w:tcW w:w="1390" w:type="dxa"/>
+          </w:tcPr>
+          <w:p/>
+        </w:tc>
+        <w:tc>
+          <w:tcPr>
+            <w:tcW w:w="1390" w:type="dxa"/>
+          </w:tcPr>
+          <w:p/>
         </w:tc>
         <w:tc>
           <w:tcPr>
             <w:tcW w:w="1154" w:type="dxa"/>
           </w:tcPr>
-          <w:p>
-            <w:r>
-              <w:t>0.7865</w:t>
-            </w:r>
-          </w:p>
+          <w:p/>
         </w:tc>
         <w:tc>
           <w:tcPr>
             <w:tcW w:w="1545" w:type="dxa"/>
           </w:tcPr>
-          <w:p>
-            <w:r>
-              <w:t>+45.37</w:t>
-            </w:r>
-          </w:p>
+          <w:p/>
         </w:tc>
         <w:tc>
           <w:tcPr>
             <w:tcW w:w="2060" w:type="dxa"/>
           </w:tcPr>
-          <w:p>
-            <w:r>
-              <w:t>+14.78</w:t>
-            </w:r>
-          </w:p>
+          <w:p/>
         </w:tc>
       </w:tr>
       <w:tr>
@@ -2991,91 +2450,55 @@
           <w:tcPr>
             <w:tcW w:w="1283" w:type="dxa"/>
           </w:tcPr>
-          <w:p>
-            <w:r>
-              <w:t>73.55</w:t>
-            </w:r>
-          </w:p>
+          <w:p/>
         </w:tc>
         <w:tc>
           <w:tcPr>
             <w:tcW w:w="1183" w:type="dxa"/>
           </w:tcPr>
-          <w:p>
-            <w:r>
-              <w:t>8.34</w:t>
-            </w:r>
-          </w:p>
+          <w:p/>
         </w:tc>
         <w:tc>
           <w:tcPr>
             <w:tcW w:w="1207" w:type="dxa"/>
           </w:tcPr>
-          <w:p>
-            <w:r>
-              <w:t>8.12</w:t>
-            </w:r>
-          </w:p>
+          <w:p/>
         </w:tc>
         <w:tc>
           <w:tcPr>
             <w:tcW w:w="1240" w:type="dxa"/>
           </w:tcPr>
-          <w:p>
-            <w:r>
-              <w:t>9.99</w:t>
-            </w:r>
-          </w:p>
-        </w:tc>
-        <w:tc>
-          <w:tcPr>
-            <w:tcW w:w="1390" w:type="dxa"/>
-          </w:tcPr>
-          <w:p>
-            <w:r>
-              <w:t>102,009</w:t>
-            </w:r>
-          </w:p>
-        </w:tc>
-        <w:tc>
-          <w:tcPr>
-            <w:tcW w:w="1390" w:type="dxa"/>
-          </w:tcPr>
-          <w:p>
-            <w:r>
-              <w:t>125,522</w:t>
-            </w:r>
-          </w:p>
+          <w:p/>
+        </w:tc>
+        <w:tc>
+          <w:tcPr>
+            <w:tcW w:w="1390" w:type="dxa"/>
+          </w:tcPr>
+          <w:p/>
+        </w:tc>
+        <w:tc>
+          <w:tcPr>
+            <w:tcW w:w="1390" w:type="dxa"/>
+          </w:tcPr>
+          <w:p/>
         </w:tc>
         <w:tc>
           <w:tcPr>
             <w:tcW w:w="1154" w:type="dxa"/>
           </w:tcPr>
-          <w:p>
-            <w:r>
-              <w:t>0.7031</w:t>
-            </w:r>
-          </w:p>
+          <w:p/>
         </w:tc>
         <w:tc>
           <w:tcPr>
             <w:tcW w:w="1545" w:type="dxa"/>
           </w:tcPr>
-          <w:p>
-            <w:r>
-              <w:t>+38.72</w:t>
-            </w:r>
-          </w:p>
+          <w:p/>
         </w:tc>
         <w:tc>
           <w:tcPr>
             <w:tcW w:w="2060" w:type="dxa"/>
           </w:tcPr>
-          <w:p>
-            <w:r>
-              <w:t>+12.56</w:t>
-            </w:r>
-          </w:p>
+          <w:p/>
         </w:tc>
       </w:tr>
       <w:tr>
@@ -3093,91 +2516,55 @@
           <w:tcPr>
             <w:tcW w:w="1283" w:type="dxa"/>
           </w:tcPr>
-          <w:p>
-            <w:r>
-              <w:t>73.82</w:t>
-            </w:r>
-          </w:p>
+          <w:p/>
         </w:tc>
         <w:tc>
           <w:tcPr>
             <w:tcW w:w="1183" w:type="dxa"/>
           </w:tcPr>
-          <w:p>
-            <w:r>
-              <w:t>8.23</w:t>
-            </w:r>
-          </w:p>
+          <w:p/>
         </w:tc>
         <w:tc>
           <w:tcPr>
             <w:tcW w:w="1207" w:type="dxa"/>
           </w:tcPr>
-          <w:p>
-            <w:r>
-              <w:t>8.00</w:t>
-            </w:r>
-          </w:p>
+          <w:p/>
         </w:tc>
         <w:tc>
           <w:tcPr>
             <w:tcW w:w="1240" w:type="dxa"/>
           </w:tcPr>
-          <w:p>
-            <w:r>
-              <w:t>9.95</w:t>
-            </w:r>
-          </w:p>
-        </w:tc>
-        <w:tc>
-          <w:tcPr>
-            <w:tcW w:w="1390" w:type="dxa"/>
-          </w:tcPr>
-          <w:p>
-            <w:r>
-              <w:t>100,596</w:t>
-            </w:r>
-          </w:p>
-        </w:tc>
-        <w:tc>
-          <w:tcPr>
-            <w:tcW w:w="1390" w:type="dxa"/>
-          </w:tcPr>
-          <w:p>
-            <w:r>
-              <w:t>125,022</w:t>
-            </w:r>
-          </w:p>
+          <w:p/>
+        </w:tc>
+        <w:tc>
+          <w:tcPr>
+            <w:tcW w:w="1390" w:type="dxa"/>
+          </w:tcPr>
+          <w:p/>
+        </w:tc>
+        <w:tc>
+          <w:tcPr>
+            <w:tcW w:w="1390" w:type="dxa"/>
+          </w:tcPr>
+          <w:p/>
         </w:tc>
         <w:tc>
           <w:tcPr>
             <w:tcW w:w="1154" w:type="dxa"/>
           </w:tcPr>
-          <w:p>
-            <w:r>
-              <w:t>0.7054</w:t>
-            </w:r>
-          </w:p>
+          <w:p/>
         </w:tc>
         <w:tc>
           <w:tcPr>
             <w:tcW w:w="1545" w:type="dxa"/>
           </w:tcPr>
-          <w:p>
-            <w:r>
-              <w:t>+38.99</w:t>
-            </w:r>
-          </w:p>
+          <w:p/>
         </w:tc>
         <w:tc>
           <w:tcPr>
             <w:tcW w:w="2060" w:type="dxa"/>
           </w:tcPr>
-          <w:p>
-            <w:r>
-              <w:t>+12.67</w:t>
-            </w:r>
-          </w:p>
+          <w:p/>
         </w:tc>
       </w:tr>
     </w:tbl>
@@ -3214,13 +2601,7 @@
             </w:pPr>
             <w:r>
               <w:lastRenderedPageBreak/>
-              <w:t xml:space="preserve">Lookback Window (Days): </w:t>
-            </w:r>
-            <w:r>
-              <w:t>28</w:t>
-            </w:r>
-            <w:r>
-              <w:t xml:space="preserve">; Forecast Horizon (Days): 7; </w:t>
+              <w:t xml:space="preserve">Lookback Window (Days): 28; Forecast Horizon (Days): 7; </w:t>
             </w:r>
             <w:r>
               <w:rPr>
@@ -4159,13 +3540,7 @@
             </w:pPr>
             <w:r>
               <w:lastRenderedPageBreak/>
-              <w:t xml:space="preserve">Lookback Window (Days): </w:t>
-            </w:r>
-            <w:r>
-              <w:t>28</w:t>
-            </w:r>
-            <w:r>
-              <w:t xml:space="preserve">; Forecast Horizon (Days): 7; </w:t>
+              <w:t xml:space="preserve">Lookback Window (Days): 28; Forecast Horizon (Days): 7; </w:t>
             </w:r>
             <w:r>
               <w:rPr>
@@ -4967,10 +4342,2566 @@
               <w:jc w:val="center"/>
             </w:pPr>
             <w:r>
+              <w:t xml:space="preserve">Lookback Window (Days): 28; Forecast Horizon (Days): 7; </w:t>
+            </w:r>
+            <w:r>
+              <w:rPr>
+                <w:b/>
+                <w:bCs/>
+              </w:rPr>
+              <w:t>NOT</w:t>
+            </w:r>
+            <w:r>
+              <w:t xml:space="preserve"> include MCO; </w:t>
+            </w:r>
+            <w:r>
+              <w:rPr>
+                <w:b/>
+                <w:bCs/>
+              </w:rPr>
+              <w:t xml:space="preserve">NO </w:t>
+            </w:r>
+            <w:r>
+              <w:t>fine-tuning</w:t>
+            </w:r>
+          </w:p>
+        </w:tc>
+      </w:tr>
+      <w:tr>
+        <w:tc>
+          <w:tcPr>
+            <w:tcW w:w="13948" w:type="dxa"/>
+            <w:gridSpan w:val="10"/>
+            <w:shd w:val="clear" w:color="auto" w:fill="DAE9F7" w:themeFill="text2" w:themeFillTint="1A"/>
+            <w:vAlign w:val="center"/>
+          </w:tcPr>
+          <w:p>
+            <w:pPr>
+              <w:jc w:val="center"/>
+            </w:pPr>
+            <w:r>
+              <w:t>Attention-based Models</w:t>
+            </w:r>
+          </w:p>
+        </w:tc>
+      </w:tr>
+      <w:tr>
+        <w:tc>
+          <w:tcPr>
+            <w:tcW w:w="1496" w:type="dxa"/>
+            <w:vMerge w:val="restart"/>
+            <w:shd w:val="clear" w:color="auto" w:fill="D1D1D1" w:themeFill="background2" w:themeFillShade="E6"/>
+            <w:vAlign w:val="center"/>
+          </w:tcPr>
+          <w:p>
+            <w:pPr>
+              <w:jc w:val="center"/>
+              <w:rPr>
+                <w:b/>
+                <w:bCs/>
+              </w:rPr>
+            </w:pPr>
+            <w:r>
+              <w:rPr>
+                <w:b/>
+                <w:bCs/>
+              </w:rPr>
+              <w:t>Models</w:t>
+            </w:r>
+          </w:p>
+        </w:tc>
+        <w:tc>
+          <w:tcPr>
+            <w:tcW w:w="1283" w:type="dxa"/>
+            <w:vMerge w:val="restart"/>
+            <w:shd w:val="clear" w:color="auto" w:fill="D1D1D1" w:themeFill="background2" w:themeFillShade="E6"/>
+            <w:vAlign w:val="center"/>
+          </w:tcPr>
+          <w:p>
+            <w:pPr>
+              <w:jc w:val="center"/>
+              <w:rPr>
+                <w:b/>
+                <w:bCs/>
+              </w:rPr>
+            </w:pPr>
+            <w:r>
+              <w:rPr>
+                <w:b/>
+                <w:bCs/>
+              </w:rPr>
+              <w:t>Combined</w:t>
+            </w:r>
+          </w:p>
+        </w:tc>
+        <w:tc>
+          <w:tcPr>
+            <w:tcW w:w="1183" w:type="dxa"/>
+            <w:vMerge w:val="restart"/>
+            <w:shd w:val="clear" w:color="auto" w:fill="D1D1D1" w:themeFill="background2" w:themeFillShade="E6"/>
+            <w:vAlign w:val="center"/>
+          </w:tcPr>
+          <w:p>
+            <w:pPr>
+              <w:jc w:val="center"/>
+              <w:rPr>
+                <w:b/>
+                <w:bCs/>
+              </w:rPr>
+            </w:pPr>
+            <w:r>
+              <w:rPr>
+                <w:b/>
+                <w:bCs/>
+              </w:rPr>
+              <w:t>MAPE</w:t>
+            </w:r>
+          </w:p>
+        </w:tc>
+        <w:tc>
+          <w:tcPr>
+            <w:tcW w:w="1207" w:type="dxa"/>
+            <w:vMerge w:val="restart"/>
+            <w:shd w:val="clear" w:color="auto" w:fill="D1D1D1" w:themeFill="background2" w:themeFillShade="E6"/>
+            <w:vAlign w:val="center"/>
+          </w:tcPr>
+          <w:p>
+            <w:pPr>
+              <w:jc w:val="center"/>
+              <w:rPr>
+                <w:b/>
+                <w:bCs/>
+              </w:rPr>
+            </w:pPr>
+            <w:r>
+              <w:rPr>
+                <w:b/>
+                <w:bCs/>
+              </w:rPr>
+              <w:t>MAE%</w:t>
+            </w:r>
+          </w:p>
+        </w:tc>
+        <w:tc>
+          <w:tcPr>
+            <w:tcW w:w="1240" w:type="dxa"/>
+            <w:vMerge w:val="restart"/>
+            <w:shd w:val="clear" w:color="auto" w:fill="D1D1D1" w:themeFill="background2" w:themeFillShade="E6"/>
+            <w:vAlign w:val="center"/>
+          </w:tcPr>
+          <w:p>
+            <w:pPr>
+              <w:jc w:val="center"/>
+              <w:rPr>
+                <w:b/>
+                <w:bCs/>
+              </w:rPr>
+            </w:pPr>
+            <w:r>
+              <w:rPr>
+                <w:b/>
+                <w:bCs/>
+              </w:rPr>
+              <w:t>RMSE%</w:t>
+            </w:r>
+          </w:p>
+        </w:tc>
+        <w:tc>
+          <w:tcPr>
+            <w:tcW w:w="1390" w:type="dxa"/>
+            <w:vMerge w:val="restart"/>
+            <w:shd w:val="clear" w:color="auto" w:fill="D1D1D1" w:themeFill="background2" w:themeFillShade="E6"/>
+            <w:vAlign w:val="center"/>
+          </w:tcPr>
+          <w:p>
+            <w:pPr>
+              <w:jc w:val="center"/>
+              <w:rPr>
+                <w:b/>
+                <w:bCs/>
+              </w:rPr>
+            </w:pPr>
+            <w:r>
+              <w:rPr>
+                <w:b/>
+                <w:bCs/>
+              </w:rPr>
+              <w:t>MAE (Ridership)</w:t>
+            </w:r>
+          </w:p>
+        </w:tc>
+        <w:tc>
+          <w:tcPr>
+            <w:tcW w:w="1390" w:type="dxa"/>
+            <w:vMerge w:val="restart"/>
+            <w:shd w:val="clear" w:color="auto" w:fill="D1D1D1" w:themeFill="background2" w:themeFillShade="E6"/>
+            <w:vAlign w:val="center"/>
+          </w:tcPr>
+          <w:p>
+            <w:pPr>
+              <w:jc w:val="center"/>
+              <w:rPr>
+                <w:b/>
+                <w:bCs/>
+              </w:rPr>
+            </w:pPr>
+            <w:r>
+              <w:rPr>
+                <w:b/>
+                <w:bCs/>
+              </w:rPr>
+              <w:t>RMSE (Ridership)</w:t>
+            </w:r>
+          </w:p>
+        </w:tc>
+        <w:tc>
+          <w:tcPr>
+            <w:tcW w:w="1154" w:type="dxa"/>
+            <w:vMerge w:val="restart"/>
+            <w:shd w:val="clear" w:color="auto" w:fill="D1D1D1" w:themeFill="background2" w:themeFillShade="E6"/>
+            <w:vAlign w:val="center"/>
+          </w:tcPr>
+          <w:p>
+            <w:pPr>
+              <w:jc w:val="center"/>
+              <w:rPr>
+                <w:b/>
+                <w:bCs/>
+                <w:vertAlign w:val="superscript"/>
+              </w:rPr>
+            </w:pPr>
+            <w:r>
+              <w:rPr>
+                <w:b/>
+                <w:bCs/>
+              </w:rPr>
+              <w:t>R</w:t>
+            </w:r>
+            <w:r>
+              <w:rPr>
+                <w:b/>
+                <w:bCs/>
+                <w:vertAlign w:val="superscript"/>
+              </w:rPr>
+              <w:t>2</w:t>
+            </w:r>
+          </w:p>
+        </w:tc>
+        <w:tc>
+          <w:tcPr>
+            <w:tcW w:w="3605" w:type="dxa"/>
+            <w:gridSpan w:val="2"/>
+            <w:shd w:val="clear" w:color="auto" w:fill="D1D1D1" w:themeFill="background2" w:themeFillShade="E6"/>
+            <w:vAlign w:val="center"/>
+          </w:tcPr>
+          <w:p>
+            <w:pPr>
+              <w:jc w:val="center"/>
+              <w:rPr>
+                <w:b/>
+                <w:bCs/>
+              </w:rPr>
+            </w:pPr>
+            <w:r>
+              <w:rPr>
+                <w:b/>
+                <w:bCs/>
+              </w:rPr>
+              <w:t>Differences to Naïve Persistence</w:t>
+            </w:r>
+          </w:p>
+        </w:tc>
+      </w:tr>
+      <w:tr>
+        <w:tc>
+          <w:tcPr>
+            <w:tcW w:w="1496" w:type="dxa"/>
+            <w:vMerge/>
+            <w:shd w:val="clear" w:color="auto" w:fill="D1D1D1" w:themeFill="background2" w:themeFillShade="E6"/>
+          </w:tcPr>
+          <w:p>
+            <w:pPr>
+              <w:rPr>
+                <w:b/>
+                <w:bCs/>
+              </w:rPr>
+            </w:pPr>
+          </w:p>
+        </w:tc>
+        <w:tc>
+          <w:tcPr>
+            <w:tcW w:w="1283" w:type="dxa"/>
+            <w:vMerge/>
+            <w:shd w:val="clear" w:color="auto" w:fill="D1D1D1" w:themeFill="background2" w:themeFillShade="E6"/>
+          </w:tcPr>
+          <w:p>
+            <w:pPr>
+              <w:rPr>
+                <w:b/>
+                <w:bCs/>
+              </w:rPr>
+            </w:pPr>
+          </w:p>
+        </w:tc>
+        <w:tc>
+          <w:tcPr>
+            <w:tcW w:w="1183" w:type="dxa"/>
+            <w:vMerge/>
+            <w:shd w:val="clear" w:color="auto" w:fill="D1D1D1" w:themeFill="background2" w:themeFillShade="E6"/>
+          </w:tcPr>
+          <w:p>
+            <w:pPr>
+              <w:rPr>
+                <w:b/>
+                <w:bCs/>
+              </w:rPr>
+            </w:pPr>
+          </w:p>
+        </w:tc>
+        <w:tc>
+          <w:tcPr>
+            <w:tcW w:w="1207" w:type="dxa"/>
+            <w:vMerge/>
+            <w:shd w:val="clear" w:color="auto" w:fill="D1D1D1" w:themeFill="background2" w:themeFillShade="E6"/>
+          </w:tcPr>
+          <w:p>
+            <w:pPr>
+              <w:rPr>
+                <w:b/>
+                <w:bCs/>
+              </w:rPr>
+            </w:pPr>
+          </w:p>
+        </w:tc>
+        <w:tc>
+          <w:tcPr>
+            <w:tcW w:w="1240" w:type="dxa"/>
+            <w:vMerge/>
+            <w:shd w:val="clear" w:color="auto" w:fill="D1D1D1" w:themeFill="background2" w:themeFillShade="E6"/>
+          </w:tcPr>
+          <w:p>
+            <w:pPr>
+              <w:rPr>
+                <w:b/>
+                <w:bCs/>
+              </w:rPr>
+            </w:pPr>
+          </w:p>
+        </w:tc>
+        <w:tc>
+          <w:tcPr>
+            <w:tcW w:w="1390" w:type="dxa"/>
+            <w:vMerge/>
+            <w:shd w:val="clear" w:color="auto" w:fill="D1D1D1" w:themeFill="background2" w:themeFillShade="E6"/>
+          </w:tcPr>
+          <w:p>
+            <w:pPr>
+              <w:rPr>
+                <w:b/>
+                <w:bCs/>
+              </w:rPr>
+            </w:pPr>
+          </w:p>
+        </w:tc>
+        <w:tc>
+          <w:tcPr>
+            <w:tcW w:w="1390" w:type="dxa"/>
+            <w:vMerge/>
+            <w:shd w:val="clear" w:color="auto" w:fill="D1D1D1" w:themeFill="background2" w:themeFillShade="E6"/>
+          </w:tcPr>
+          <w:p>
+            <w:pPr>
+              <w:rPr>
+                <w:b/>
+                <w:bCs/>
+              </w:rPr>
+            </w:pPr>
+          </w:p>
+        </w:tc>
+        <w:tc>
+          <w:tcPr>
+            <w:tcW w:w="1154" w:type="dxa"/>
+            <w:vMerge/>
+            <w:shd w:val="clear" w:color="auto" w:fill="D1D1D1" w:themeFill="background2" w:themeFillShade="E6"/>
+          </w:tcPr>
+          <w:p>
+            <w:pPr>
+              <w:rPr>
+                <w:b/>
+                <w:bCs/>
+              </w:rPr>
+            </w:pPr>
+          </w:p>
+        </w:tc>
+        <w:tc>
+          <w:tcPr>
+            <w:tcW w:w="1545" w:type="dxa"/>
+            <w:shd w:val="clear" w:color="auto" w:fill="D1D1D1" w:themeFill="background2" w:themeFillShade="E6"/>
+            <w:vAlign w:val="center"/>
+          </w:tcPr>
+          <w:p>
+            <w:pPr>
+              <w:jc w:val="center"/>
+              <w:rPr>
+                <w:b/>
+                <w:bCs/>
+              </w:rPr>
+            </w:pPr>
+            <w:r>
+              <w:rPr>
+                <w:b/>
+                <w:bCs/>
+              </w:rPr>
+              <w:t>Combined</w:t>
+            </w:r>
+          </w:p>
+        </w:tc>
+        <w:tc>
+          <w:tcPr>
+            <w:tcW w:w="2060" w:type="dxa"/>
+            <w:shd w:val="clear" w:color="auto" w:fill="D1D1D1" w:themeFill="background2" w:themeFillShade="E6"/>
+            <w:vAlign w:val="center"/>
+          </w:tcPr>
+          <w:p>
+            <w:pPr>
+              <w:jc w:val="center"/>
+              <w:rPr>
+                <w:b/>
+                <w:bCs/>
+                <w:vertAlign w:val="superscript"/>
+              </w:rPr>
+            </w:pPr>
+            <w:r>
+              <w:rPr>
+                <w:b/>
+                <w:bCs/>
+              </w:rPr>
+              <w:t>MAPE</w:t>
+            </w:r>
+          </w:p>
+        </w:tc>
+      </w:tr>
+      <w:tr>
+        <w:tc>
+          <w:tcPr>
+            <w:tcW w:w="1496" w:type="dxa"/>
+          </w:tcPr>
+          <w:p>
+            <w:r>
+              <w:t>ASTGCN</w:t>
+            </w:r>
+          </w:p>
+        </w:tc>
+        <w:tc>
+          <w:tcPr>
+            <w:tcW w:w="1283" w:type="dxa"/>
+          </w:tcPr>
+          <w:p/>
+        </w:tc>
+        <w:tc>
+          <w:tcPr>
+            <w:tcW w:w="1183" w:type="dxa"/>
+          </w:tcPr>
+          <w:p/>
+        </w:tc>
+        <w:tc>
+          <w:tcPr>
+            <w:tcW w:w="1207" w:type="dxa"/>
+          </w:tcPr>
+          <w:p/>
+        </w:tc>
+        <w:tc>
+          <w:tcPr>
+            <w:tcW w:w="1240" w:type="dxa"/>
+          </w:tcPr>
+          <w:p/>
+        </w:tc>
+        <w:tc>
+          <w:tcPr>
+            <w:tcW w:w="1390" w:type="dxa"/>
+          </w:tcPr>
+          <w:p/>
+        </w:tc>
+        <w:tc>
+          <w:tcPr>
+            <w:tcW w:w="1390" w:type="dxa"/>
+          </w:tcPr>
+          <w:p/>
+        </w:tc>
+        <w:tc>
+          <w:tcPr>
+            <w:tcW w:w="1154" w:type="dxa"/>
+          </w:tcPr>
+          <w:p/>
+        </w:tc>
+        <w:tc>
+          <w:tcPr>
+            <w:tcW w:w="1545" w:type="dxa"/>
+          </w:tcPr>
+          <w:p/>
+        </w:tc>
+        <w:tc>
+          <w:tcPr>
+            <w:tcW w:w="2060" w:type="dxa"/>
+          </w:tcPr>
+          <w:p/>
+        </w:tc>
+      </w:tr>
+      <w:tr>
+        <w:tc>
+          <w:tcPr>
+            <w:tcW w:w="1496" w:type="dxa"/>
+          </w:tcPr>
+          <w:p>
+            <w:r>
+              <w:t>Autoformer</w:t>
+            </w:r>
+          </w:p>
+        </w:tc>
+        <w:tc>
+          <w:tcPr>
+            <w:tcW w:w="1283" w:type="dxa"/>
+          </w:tcPr>
+          <w:p/>
+        </w:tc>
+        <w:tc>
+          <w:tcPr>
+            <w:tcW w:w="1183" w:type="dxa"/>
+          </w:tcPr>
+          <w:p/>
+        </w:tc>
+        <w:tc>
+          <w:tcPr>
+            <w:tcW w:w="1207" w:type="dxa"/>
+          </w:tcPr>
+          <w:p/>
+        </w:tc>
+        <w:tc>
+          <w:tcPr>
+            <w:tcW w:w="1240" w:type="dxa"/>
+          </w:tcPr>
+          <w:p/>
+        </w:tc>
+        <w:tc>
+          <w:tcPr>
+            <w:tcW w:w="1390" w:type="dxa"/>
+          </w:tcPr>
+          <w:p/>
+        </w:tc>
+        <w:tc>
+          <w:tcPr>
+            <w:tcW w:w="1390" w:type="dxa"/>
+          </w:tcPr>
+          <w:p/>
+        </w:tc>
+        <w:tc>
+          <w:tcPr>
+            <w:tcW w:w="1154" w:type="dxa"/>
+          </w:tcPr>
+          <w:p/>
+        </w:tc>
+        <w:tc>
+          <w:tcPr>
+            <w:tcW w:w="1545" w:type="dxa"/>
+          </w:tcPr>
+          <w:p/>
+        </w:tc>
+        <w:tc>
+          <w:tcPr>
+            <w:tcW w:w="2060" w:type="dxa"/>
+          </w:tcPr>
+          <w:p/>
+        </w:tc>
+      </w:tr>
+      <w:tr>
+        <w:tc>
+          <w:tcPr>
+            <w:tcW w:w="1496" w:type="dxa"/>
+          </w:tcPr>
+          <w:p>
+            <w:r>
+              <w:t>Informer</w:t>
+            </w:r>
+          </w:p>
+        </w:tc>
+        <w:tc>
+          <w:tcPr>
+            <w:tcW w:w="1283" w:type="dxa"/>
+          </w:tcPr>
+          <w:p/>
+        </w:tc>
+        <w:tc>
+          <w:tcPr>
+            <w:tcW w:w="1183" w:type="dxa"/>
+          </w:tcPr>
+          <w:p/>
+        </w:tc>
+        <w:tc>
+          <w:tcPr>
+            <w:tcW w:w="1207" w:type="dxa"/>
+          </w:tcPr>
+          <w:p/>
+        </w:tc>
+        <w:tc>
+          <w:tcPr>
+            <w:tcW w:w="1240" w:type="dxa"/>
+          </w:tcPr>
+          <w:p/>
+        </w:tc>
+        <w:tc>
+          <w:tcPr>
+            <w:tcW w:w="1390" w:type="dxa"/>
+          </w:tcPr>
+          <w:p/>
+        </w:tc>
+        <w:tc>
+          <w:tcPr>
+            <w:tcW w:w="1390" w:type="dxa"/>
+          </w:tcPr>
+          <w:p/>
+        </w:tc>
+        <w:tc>
+          <w:tcPr>
+            <w:tcW w:w="1154" w:type="dxa"/>
+          </w:tcPr>
+          <w:p/>
+        </w:tc>
+        <w:tc>
+          <w:tcPr>
+            <w:tcW w:w="1545" w:type="dxa"/>
+          </w:tcPr>
+          <w:p/>
+        </w:tc>
+        <w:tc>
+          <w:tcPr>
+            <w:tcW w:w="2060" w:type="dxa"/>
+          </w:tcPr>
+          <w:p/>
+        </w:tc>
+      </w:tr>
+      <w:tr>
+        <w:tc>
+          <w:tcPr>
+            <w:tcW w:w="1496" w:type="dxa"/>
+          </w:tcPr>
+          <w:p>
+            <w:r>
+              <w:t>TFT</w:t>
+            </w:r>
+          </w:p>
+        </w:tc>
+        <w:tc>
+          <w:tcPr>
+            <w:tcW w:w="1283" w:type="dxa"/>
+          </w:tcPr>
+          <w:p/>
+        </w:tc>
+        <w:tc>
+          <w:tcPr>
+            <w:tcW w:w="1183" w:type="dxa"/>
+          </w:tcPr>
+          <w:p/>
+        </w:tc>
+        <w:tc>
+          <w:tcPr>
+            <w:tcW w:w="1207" w:type="dxa"/>
+          </w:tcPr>
+          <w:p/>
+        </w:tc>
+        <w:tc>
+          <w:tcPr>
+            <w:tcW w:w="1240" w:type="dxa"/>
+          </w:tcPr>
+          <w:p/>
+        </w:tc>
+        <w:tc>
+          <w:tcPr>
+            <w:tcW w:w="1390" w:type="dxa"/>
+          </w:tcPr>
+          <w:p/>
+        </w:tc>
+        <w:tc>
+          <w:tcPr>
+            <w:tcW w:w="1390" w:type="dxa"/>
+          </w:tcPr>
+          <w:p/>
+        </w:tc>
+        <w:tc>
+          <w:tcPr>
+            <w:tcW w:w="1154" w:type="dxa"/>
+          </w:tcPr>
+          <w:p/>
+        </w:tc>
+        <w:tc>
+          <w:tcPr>
+            <w:tcW w:w="1545" w:type="dxa"/>
+          </w:tcPr>
+          <w:p/>
+        </w:tc>
+        <w:tc>
+          <w:tcPr>
+            <w:tcW w:w="2060" w:type="dxa"/>
+          </w:tcPr>
+          <w:p/>
+        </w:tc>
+      </w:tr>
+      <w:tr>
+        <w:tc>
+          <w:tcPr>
+            <w:tcW w:w="1496" w:type="dxa"/>
+          </w:tcPr>
+          <w:p>
+            <w:r>
+              <w:t>TPA-LSTM</w:t>
+            </w:r>
+          </w:p>
+        </w:tc>
+        <w:tc>
+          <w:tcPr>
+            <w:tcW w:w="1283" w:type="dxa"/>
+          </w:tcPr>
+          <w:p/>
+        </w:tc>
+        <w:tc>
+          <w:tcPr>
+            <w:tcW w:w="1183" w:type="dxa"/>
+          </w:tcPr>
+          <w:p/>
+        </w:tc>
+        <w:tc>
+          <w:tcPr>
+            <w:tcW w:w="1207" w:type="dxa"/>
+          </w:tcPr>
+          <w:p/>
+        </w:tc>
+        <w:tc>
+          <w:tcPr>
+            <w:tcW w:w="1240" w:type="dxa"/>
+          </w:tcPr>
+          <w:p/>
+        </w:tc>
+        <w:tc>
+          <w:tcPr>
+            <w:tcW w:w="1390" w:type="dxa"/>
+          </w:tcPr>
+          <w:p/>
+        </w:tc>
+        <w:tc>
+          <w:tcPr>
+            <w:tcW w:w="1390" w:type="dxa"/>
+          </w:tcPr>
+          <w:p/>
+        </w:tc>
+        <w:tc>
+          <w:tcPr>
+            <w:tcW w:w="1154" w:type="dxa"/>
+          </w:tcPr>
+          <w:p/>
+        </w:tc>
+        <w:tc>
+          <w:tcPr>
+            <w:tcW w:w="1545" w:type="dxa"/>
+          </w:tcPr>
+          <w:p/>
+        </w:tc>
+        <w:tc>
+          <w:tcPr>
+            <w:tcW w:w="2060" w:type="dxa"/>
+          </w:tcPr>
+          <w:p/>
+        </w:tc>
+      </w:tr>
+    </w:tbl>
+    <w:p/>
+    <w:tbl>
+      <w:tblPr>
+        <w:tblStyle w:val="TableGrid"/>
+        <w:tblW w:w="0" w:type="auto"/>
+        <w:tblLook w:val="04A0" w:firstRow="1" w:lastRow="0" w:firstColumn="1" w:lastColumn="0" w:noHBand="0" w:noVBand="1"/>
+      </w:tblPr>
+      <w:tblGrid>
+        <w:gridCol w:w="1496"/>
+        <w:gridCol w:w="1283"/>
+        <w:gridCol w:w="1183"/>
+        <w:gridCol w:w="1207"/>
+        <w:gridCol w:w="1240"/>
+        <w:gridCol w:w="1390"/>
+        <w:gridCol w:w="1390"/>
+        <w:gridCol w:w="1154"/>
+        <w:gridCol w:w="1545"/>
+        <w:gridCol w:w="2060"/>
+      </w:tblGrid>
+      <w:tr>
+        <w:tc>
+          <w:tcPr>
+            <w:tcW w:w="13948" w:type="dxa"/>
+            <w:gridSpan w:val="10"/>
+            <w:shd w:val="clear" w:color="auto" w:fill="C1E4F5" w:themeFill="accent1" w:themeFillTint="33"/>
+            <w:vAlign w:val="center"/>
+          </w:tcPr>
+          <w:p>
+            <w:pPr>
+              <w:jc w:val="center"/>
+            </w:pPr>
+            <w:r>
+              <w:lastRenderedPageBreak/>
               <w:t xml:space="preserve">Lookback Window (Days): </w:t>
             </w:r>
             <w:r>
-              <w:t>28</w:t>
+              <w:t>56</w:t>
+            </w:r>
+            <w:r>
+              <w:t xml:space="preserve">; Forecast Horizon (Days): 7; </w:t>
+            </w:r>
+            <w:r>
+              <w:rPr>
+                <w:b/>
+                <w:bCs/>
+              </w:rPr>
+              <w:t>NOT</w:t>
+            </w:r>
+            <w:r>
+              <w:t xml:space="preserve"> include MCO; </w:t>
+            </w:r>
+            <w:r>
+              <w:rPr>
+                <w:b/>
+                <w:bCs/>
+              </w:rPr>
+              <w:t xml:space="preserve">NO </w:t>
+            </w:r>
+            <w:r>
+              <w:t>fine-tuning</w:t>
+            </w:r>
+          </w:p>
+        </w:tc>
+      </w:tr>
+      <w:tr>
+        <w:tc>
+          <w:tcPr>
+            <w:tcW w:w="13948" w:type="dxa"/>
+            <w:gridSpan w:val="10"/>
+            <w:shd w:val="clear" w:color="auto" w:fill="DAE9F7" w:themeFill="text2" w:themeFillTint="1A"/>
+            <w:vAlign w:val="center"/>
+          </w:tcPr>
+          <w:p>
+            <w:pPr>
+              <w:jc w:val="center"/>
+            </w:pPr>
+            <w:r>
+              <w:t>Spatio-temporal-based Models</w:t>
+            </w:r>
+          </w:p>
+        </w:tc>
+      </w:tr>
+      <w:tr>
+        <w:tc>
+          <w:tcPr>
+            <w:tcW w:w="1496" w:type="dxa"/>
+            <w:vMerge w:val="restart"/>
+            <w:shd w:val="clear" w:color="auto" w:fill="D1D1D1" w:themeFill="background2" w:themeFillShade="E6"/>
+            <w:vAlign w:val="center"/>
+          </w:tcPr>
+          <w:p>
+            <w:pPr>
+              <w:jc w:val="center"/>
+              <w:rPr>
+                <w:b/>
+                <w:bCs/>
+              </w:rPr>
+            </w:pPr>
+            <w:r>
+              <w:rPr>
+                <w:b/>
+                <w:bCs/>
+              </w:rPr>
+              <w:t>Models</w:t>
+            </w:r>
+          </w:p>
+        </w:tc>
+        <w:tc>
+          <w:tcPr>
+            <w:tcW w:w="1283" w:type="dxa"/>
+            <w:vMerge w:val="restart"/>
+            <w:shd w:val="clear" w:color="auto" w:fill="D1D1D1" w:themeFill="background2" w:themeFillShade="E6"/>
+            <w:vAlign w:val="center"/>
+          </w:tcPr>
+          <w:p>
+            <w:pPr>
+              <w:jc w:val="center"/>
+              <w:rPr>
+                <w:b/>
+                <w:bCs/>
+              </w:rPr>
+            </w:pPr>
+            <w:r>
+              <w:rPr>
+                <w:b/>
+                <w:bCs/>
+              </w:rPr>
+              <w:t>Combined</w:t>
+            </w:r>
+          </w:p>
+        </w:tc>
+        <w:tc>
+          <w:tcPr>
+            <w:tcW w:w="1183" w:type="dxa"/>
+            <w:vMerge w:val="restart"/>
+            <w:shd w:val="clear" w:color="auto" w:fill="D1D1D1" w:themeFill="background2" w:themeFillShade="E6"/>
+            <w:vAlign w:val="center"/>
+          </w:tcPr>
+          <w:p>
+            <w:pPr>
+              <w:jc w:val="center"/>
+              <w:rPr>
+                <w:b/>
+                <w:bCs/>
+              </w:rPr>
+            </w:pPr>
+            <w:r>
+              <w:rPr>
+                <w:b/>
+                <w:bCs/>
+              </w:rPr>
+              <w:t>MAPE</w:t>
+            </w:r>
+          </w:p>
+        </w:tc>
+        <w:tc>
+          <w:tcPr>
+            <w:tcW w:w="1207" w:type="dxa"/>
+            <w:vMerge w:val="restart"/>
+            <w:shd w:val="clear" w:color="auto" w:fill="D1D1D1" w:themeFill="background2" w:themeFillShade="E6"/>
+            <w:vAlign w:val="center"/>
+          </w:tcPr>
+          <w:p>
+            <w:pPr>
+              <w:jc w:val="center"/>
+              <w:rPr>
+                <w:b/>
+                <w:bCs/>
+              </w:rPr>
+            </w:pPr>
+            <w:r>
+              <w:rPr>
+                <w:b/>
+                <w:bCs/>
+              </w:rPr>
+              <w:t>MAE%</w:t>
+            </w:r>
+          </w:p>
+        </w:tc>
+        <w:tc>
+          <w:tcPr>
+            <w:tcW w:w="1240" w:type="dxa"/>
+            <w:vMerge w:val="restart"/>
+            <w:shd w:val="clear" w:color="auto" w:fill="D1D1D1" w:themeFill="background2" w:themeFillShade="E6"/>
+            <w:vAlign w:val="center"/>
+          </w:tcPr>
+          <w:p>
+            <w:pPr>
+              <w:jc w:val="center"/>
+              <w:rPr>
+                <w:b/>
+                <w:bCs/>
+              </w:rPr>
+            </w:pPr>
+            <w:r>
+              <w:rPr>
+                <w:b/>
+                <w:bCs/>
+              </w:rPr>
+              <w:t>RMSE%</w:t>
+            </w:r>
+          </w:p>
+        </w:tc>
+        <w:tc>
+          <w:tcPr>
+            <w:tcW w:w="1390" w:type="dxa"/>
+            <w:vMerge w:val="restart"/>
+            <w:shd w:val="clear" w:color="auto" w:fill="D1D1D1" w:themeFill="background2" w:themeFillShade="E6"/>
+            <w:vAlign w:val="center"/>
+          </w:tcPr>
+          <w:p>
+            <w:pPr>
+              <w:jc w:val="center"/>
+              <w:rPr>
+                <w:b/>
+                <w:bCs/>
+              </w:rPr>
+            </w:pPr>
+            <w:r>
+              <w:rPr>
+                <w:b/>
+                <w:bCs/>
+              </w:rPr>
+              <w:t>MAE (Ridership)</w:t>
+            </w:r>
+          </w:p>
+        </w:tc>
+        <w:tc>
+          <w:tcPr>
+            <w:tcW w:w="1390" w:type="dxa"/>
+            <w:vMerge w:val="restart"/>
+            <w:shd w:val="clear" w:color="auto" w:fill="D1D1D1" w:themeFill="background2" w:themeFillShade="E6"/>
+            <w:vAlign w:val="center"/>
+          </w:tcPr>
+          <w:p>
+            <w:pPr>
+              <w:jc w:val="center"/>
+              <w:rPr>
+                <w:b/>
+                <w:bCs/>
+              </w:rPr>
+            </w:pPr>
+            <w:r>
+              <w:rPr>
+                <w:b/>
+                <w:bCs/>
+              </w:rPr>
+              <w:t>RMSE (Ridership)</w:t>
+            </w:r>
+          </w:p>
+        </w:tc>
+        <w:tc>
+          <w:tcPr>
+            <w:tcW w:w="1154" w:type="dxa"/>
+            <w:vMerge w:val="restart"/>
+            <w:shd w:val="clear" w:color="auto" w:fill="D1D1D1" w:themeFill="background2" w:themeFillShade="E6"/>
+            <w:vAlign w:val="center"/>
+          </w:tcPr>
+          <w:p>
+            <w:pPr>
+              <w:jc w:val="center"/>
+              <w:rPr>
+                <w:b/>
+                <w:bCs/>
+                <w:vertAlign w:val="superscript"/>
+              </w:rPr>
+            </w:pPr>
+            <w:r>
+              <w:rPr>
+                <w:b/>
+                <w:bCs/>
+              </w:rPr>
+              <w:t>R</w:t>
+            </w:r>
+            <w:r>
+              <w:rPr>
+                <w:b/>
+                <w:bCs/>
+                <w:vertAlign w:val="superscript"/>
+              </w:rPr>
+              <w:t>2</w:t>
+            </w:r>
+          </w:p>
+        </w:tc>
+        <w:tc>
+          <w:tcPr>
+            <w:tcW w:w="3605" w:type="dxa"/>
+            <w:gridSpan w:val="2"/>
+            <w:shd w:val="clear" w:color="auto" w:fill="D1D1D1" w:themeFill="background2" w:themeFillShade="E6"/>
+            <w:vAlign w:val="center"/>
+          </w:tcPr>
+          <w:p>
+            <w:pPr>
+              <w:jc w:val="center"/>
+              <w:rPr>
+                <w:b/>
+                <w:bCs/>
+              </w:rPr>
+            </w:pPr>
+            <w:r>
+              <w:rPr>
+                <w:b/>
+                <w:bCs/>
+              </w:rPr>
+              <w:t>Differences to Naïve Persistence</w:t>
+            </w:r>
+          </w:p>
+        </w:tc>
+      </w:tr>
+      <w:tr>
+        <w:tc>
+          <w:tcPr>
+            <w:tcW w:w="1496" w:type="dxa"/>
+            <w:vMerge/>
+            <w:shd w:val="clear" w:color="auto" w:fill="D1D1D1" w:themeFill="background2" w:themeFillShade="E6"/>
+          </w:tcPr>
+          <w:p>
+            <w:pPr>
+              <w:rPr>
+                <w:b/>
+                <w:bCs/>
+              </w:rPr>
+            </w:pPr>
+          </w:p>
+        </w:tc>
+        <w:tc>
+          <w:tcPr>
+            <w:tcW w:w="1283" w:type="dxa"/>
+            <w:vMerge/>
+            <w:shd w:val="clear" w:color="auto" w:fill="D1D1D1" w:themeFill="background2" w:themeFillShade="E6"/>
+          </w:tcPr>
+          <w:p>
+            <w:pPr>
+              <w:rPr>
+                <w:b/>
+                <w:bCs/>
+              </w:rPr>
+            </w:pPr>
+          </w:p>
+        </w:tc>
+        <w:tc>
+          <w:tcPr>
+            <w:tcW w:w="1183" w:type="dxa"/>
+            <w:vMerge/>
+            <w:shd w:val="clear" w:color="auto" w:fill="D1D1D1" w:themeFill="background2" w:themeFillShade="E6"/>
+          </w:tcPr>
+          <w:p>
+            <w:pPr>
+              <w:rPr>
+                <w:b/>
+                <w:bCs/>
+              </w:rPr>
+            </w:pPr>
+          </w:p>
+        </w:tc>
+        <w:tc>
+          <w:tcPr>
+            <w:tcW w:w="1207" w:type="dxa"/>
+            <w:vMerge/>
+            <w:shd w:val="clear" w:color="auto" w:fill="D1D1D1" w:themeFill="background2" w:themeFillShade="E6"/>
+          </w:tcPr>
+          <w:p>
+            <w:pPr>
+              <w:rPr>
+                <w:b/>
+                <w:bCs/>
+              </w:rPr>
+            </w:pPr>
+          </w:p>
+        </w:tc>
+        <w:tc>
+          <w:tcPr>
+            <w:tcW w:w="1240" w:type="dxa"/>
+            <w:vMerge/>
+            <w:shd w:val="clear" w:color="auto" w:fill="D1D1D1" w:themeFill="background2" w:themeFillShade="E6"/>
+          </w:tcPr>
+          <w:p>
+            <w:pPr>
+              <w:rPr>
+                <w:b/>
+                <w:bCs/>
+              </w:rPr>
+            </w:pPr>
+          </w:p>
+        </w:tc>
+        <w:tc>
+          <w:tcPr>
+            <w:tcW w:w="1390" w:type="dxa"/>
+            <w:vMerge/>
+            <w:shd w:val="clear" w:color="auto" w:fill="D1D1D1" w:themeFill="background2" w:themeFillShade="E6"/>
+          </w:tcPr>
+          <w:p>
+            <w:pPr>
+              <w:rPr>
+                <w:b/>
+                <w:bCs/>
+              </w:rPr>
+            </w:pPr>
+          </w:p>
+        </w:tc>
+        <w:tc>
+          <w:tcPr>
+            <w:tcW w:w="1390" w:type="dxa"/>
+            <w:vMerge/>
+            <w:shd w:val="clear" w:color="auto" w:fill="D1D1D1" w:themeFill="background2" w:themeFillShade="E6"/>
+          </w:tcPr>
+          <w:p>
+            <w:pPr>
+              <w:rPr>
+                <w:b/>
+                <w:bCs/>
+              </w:rPr>
+            </w:pPr>
+          </w:p>
+        </w:tc>
+        <w:tc>
+          <w:tcPr>
+            <w:tcW w:w="1154" w:type="dxa"/>
+            <w:vMerge/>
+            <w:shd w:val="clear" w:color="auto" w:fill="D1D1D1" w:themeFill="background2" w:themeFillShade="E6"/>
+          </w:tcPr>
+          <w:p>
+            <w:pPr>
+              <w:rPr>
+                <w:b/>
+                <w:bCs/>
+              </w:rPr>
+            </w:pPr>
+          </w:p>
+        </w:tc>
+        <w:tc>
+          <w:tcPr>
+            <w:tcW w:w="1545" w:type="dxa"/>
+            <w:shd w:val="clear" w:color="auto" w:fill="D1D1D1" w:themeFill="background2" w:themeFillShade="E6"/>
+            <w:vAlign w:val="center"/>
+          </w:tcPr>
+          <w:p>
+            <w:pPr>
+              <w:jc w:val="center"/>
+              <w:rPr>
+                <w:b/>
+                <w:bCs/>
+              </w:rPr>
+            </w:pPr>
+            <w:r>
+              <w:rPr>
+                <w:b/>
+                <w:bCs/>
+              </w:rPr>
+              <w:t>Combined</w:t>
+            </w:r>
+          </w:p>
+        </w:tc>
+        <w:tc>
+          <w:tcPr>
+            <w:tcW w:w="2060" w:type="dxa"/>
+            <w:shd w:val="clear" w:color="auto" w:fill="D1D1D1" w:themeFill="background2" w:themeFillShade="E6"/>
+            <w:vAlign w:val="center"/>
+          </w:tcPr>
+          <w:p>
+            <w:pPr>
+              <w:jc w:val="center"/>
+              <w:rPr>
+                <w:b/>
+                <w:bCs/>
+                <w:vertAlign w:val="superscript"/>
+              </w:rPr>
+            </w:pPr>
+            <w:r>
+              <w:rPr>
+                <w:b/>
+                <w:bCs/>
+              </w:rPr>
+              <w:t>MAPE</w:t>
+            </w:r>
+          </w:p>
+        </w:tc>
+      </w:tr>
+      <w:tr>
+        <w:tc>
+          <w:tcPr>
+            <w:tcW w:w="1496" w:type="dxa"/>
+          </w:tcPr>
+          <w:p>
+            <w:r>
+              <w:t>LSTM</w:t>
+            </w:r>
+          </w:p>
+        </w:tc>
+        <w:tc>
+          <w:tcPr>
+            <w:tcW w:w="1283" w:type="dxa"/>
+          </w:tcPr>
+          <w:p/>
+        </w:tc>
+        <w:tc>
+          <w:tcPr>
+            <w:tcW w:w="1183" w:type="dxa"/>
+          </w:tcPr>
+          <w:p/>
+        </w:tc>
+        <w:tc>
+          <w:tcPr>
+            <w:tcW w:w="1207" w:type="dxa"/>
+          </w:tcPr>
+          <w:p/>
+        </w:tc>
+        <w:tc>
+          <w:tcPr>
+            <w:tcW w:w="1240" w:type="dxa"/>
+          </w:tcPr>
+          <w:p/>
+        </w:tc>
+        <w:tc>
+          <w:tcPr>
+            <w:tcW w:w="1390" w:type="dxa"/>
+          </w:tcPr>
+          <w:p/>
+        </w:tc>
+        <w:tc>
+          <w:tcPr>
+            <w:tcW w:w="1390" w:type="dxa"/>
+          </w:tcPr>
+          <w:p/>
+        </w:tc>
+        <w:tc>
+          <w:tcPr>
+            <w:tcW w:w="1154" w:type="dxa"/>
+          </w:tcPr>
+          <w:p/>
+        </w:tc>
+        <w:tc>
+          <w:tcPr>
+            <w:tcW w:w="1545" w:type="dxa"/>
+          </w:tcPr>
+          <w:p/>
+        </w:tc>
+        <w:tc>
+          <w:tcPr>
+            <w:tcW w:w="2060" w:type="dxa"/>
+          </w:tcPr>
+          <w:p/>
+        </w:tc>
+      </w:tr>
+      <w:tr>
+        <w:tc>
+          <w:tcPr>
+            <w:tcW w:w="1496" w:type="dxa"/>
+          </w:tcPr>
+          <w:p>
+            <w:r>
+              <w:t>BiLSTM</w:t>
+            </w:r>
+          </w:p>
+        </w:tc>
+        <w:tc>
+          <w:tcPr>
+            <w:tcW w:w="1283" w:type="dxa"/>
+          </w:tcPr>
+          <w:p/>
+        </w:tc>
+        <w:tc>
+          <w:tcPr>
+            <w:tcW w:w="1183" w:type="dxa"/>
+          </w:tcPr>
+          <w:p/>
+        </w:tc>
+        <w:tc>
+          <w:tcPr>
+            <w:tcW w:w="1207" w:type="dxa"/>
+          </w:tcPr>
+          <w:p/>
+        </w:tc>
+        <w:tc>
+          <w:tcPr>
+            <w:tcW w:w="1240" w:type="dxa"/>
+          </w:tcPr>
+          <w:p/>
+        </w:tc>
+        <w:tc>
+          <w:tcPr>
+            <w:tcW w:w="1390" w:type="dxa"/>
+          </w:tcPr>
+          <w:p/>
+        </w:tc>
+        <w:tc>
+          <w:tcPr>
+            <w:tcW w:w="1390" w:type="dxa"/>
+          </w:tcPr>
+          <w:p/>
+        </w:tc>
+        <w:tc>
+          <w:tcPr>
+            <w:tcW w:w="1154" w:type="dxa"/>
+          </w:tcPr>
+          <w:p/>
+        </w:tc>
+        <w:tc>
+          <w:tcPr>
+            <w:tcW w:w="1545" w:type="dxa"/>
+          </w:tcPr>
+          <w:p/>
+        </w:tc>
+        <w:tc>
+          <w:tcPr>
+            <w:tcW w:w="2060" w:type="dxa"/>
+          </w:tcPr>
+          <w:p/>
+        </w:tc>
+      </w:tr>
+      <w:tr>
+        <w:tc>
+          <w:tcPr>
+            <w:tcW w:w="1496" w:type="dxa"/>
+          </w:tcPr>
+          <w:p>
+            <w:r>
+              <w:t>CNN-LSTM (Sequential)</w:t>
+            </w:r>
+          </w:p>
+        </w:tc>
+        <w:tc>
+          <w:tcPr>
+            <w:tcW w:w="1283" w:type="dxa"/>
+          </w:tcPr>
+          <w:p/>
+        </w:tc>
+        <w:tc>
+          <w:tcPr>
+            <w:tcW w:w="1183" w:type="dxa"/>
+          </w:tcPr>
+          <w:p/>
+        </w:tc>
+        <w:tc>
+          <w:tcPr>
+            <w:tcW w:w="1207" w:type="dxa"/>
+          </w:tcPr>
+          <w:p/>
+        </w:tc>
+        <w:tc>
+          <w:tcPr>
+            <w:tcW w:w="1240" w:type="dxa"/>
+          </w:tcPr>
+          <w:p/>
+        </w:tc>
+        <w:tc>
+          <w:tcPr>
+            <w:tcW w:w="1390" w:type="dxa"/>
+          </w:tcPr>
+          <w:p/>
+        </w:tc>
+        <w:tc>
+          <w:tcPr>
+            <w:tcW w:w="1390" w:type="dxa"/>
+          </w:tcPr>
+          <w:p/>
+        </w:tc>
+        <w:tc>
+          <w:tcPr>
+            <w:tcW w:w="1154" w:type="dxa"/>
+          </w:tcPr>
+          <w:p/>
+        </w:tc>
+        <w:tc>
+          <w:tcPr>
+            <w:tcW w:w="1545" w:type="dxa"/>
+          </w:tcPr>
+          <w:p/>
+        </w:tc>
+        <w:tc>
+          <w:tcPr>
+            <w:tcW w:w="2060" w:type="dxa"/>
+          </w:tcPr>
+          <w:p/>
+        </w:tc>
+      </w:tr>
+      <w:tr>
+        <w:tc>
+          <w:tcPr>
+            <w:tcW w:w="1496" w:type="dxa"/>
+          </w:tcPr>
+          <w:p>
+            <w:r>
+              <w:t>CNN-LSTM (Parallel)</w:t>
+            </w:r>
+          </w:p>
+        </w:tc>
+        <w:tc>
+          <w:tcPr>
+            <w:tcW w:w="1283" w:type="dxa"/>
+          </w:tcPr>
+          <w:p/>
+        </w:tc>
+        <w:tc>
+          <w:tcPr>
+            <w:tcW w:w="1183" w:type="dxa"/>
+          </w:tcPr>
+          <w:p/>
+        </w:tc>
+        <w:tc>
+          <w:tcPr>
+            <w:tcW w:w="1207" w:type="dxa"/>
+          </w:tcPr>
+          <w:p/>
+        </w:tc>
+        <w:tc>
+          <w:tcPr>
+            <w:tcW w:w="1240" w:type="dxa"/>
+          </w:tcPr>
+          <w:p/>
+        </w:tc>
+        <w:tc>
+          <w:tcPr>
+            <w:tcW w:w="1390" w:type="dxa"/>
+          </w:tcPr>
+          <w:p/>
+        </w:tc>
+        <w:tc>
+          <w:tcPr>
+            <w:tcW w:w="1390" w:type="dxa"/>
+          </w:tcPr>
+          <w:p/>
+        </w:tc>
+        <w:tc>
+          <w:tcPr>
+            <w:tcW w:w="1154" w:type="dxa"/>
+          </w:tcPr>
+          <w:p/>
+        </w:tc>
+        <w:tc>
+          <w:tcPr>
+            <w:tcW w:w="1545" w:type="dxa"/>
+          </w:tcPr>
+          <w:p/>
+        </w:tc>
+        <w:tc>
+          <w:tcPr>
+            <w:tcW w:w="2060" w:type="dxa"/>
+          </w:tcPr>
+          <w:p/>
+        </w:tc>
+      </w:tr>
+      <w:tr>
+        <w:tc>
+          <w:tcPr>
+            <w:tcW w:w="1496" w:type="dxa"/>
+          </w:tcPr>
+          <w:p>
+            <w:r>
+              <w:t>CNN-LSTM (Augmented)</w:t>
+            </w:r>
+          </w:p>
+        </w:tc>
+        <w:tc>
+          <w:tcPr>
+            <w:tcW w:w="1283" w:type="dxa"/>
+          </w:tcPr>
+          <w:p/>
+        </w:tc>
+        <w:tc>
+          <w:tcPr>
+            <w:tcW w:w="1183" w:type="dxa"/>
+          </w:tcPr>
+          <w:p/>
+        </w:tc>
+        <w:tc>
+          <w:tcPr>
+            <w:tcW w:w="1207" w:type="dxa"/>
+          </w:tcPr>
+          <w:p/>
+        </w:tc>
+        <w:tc>
+          <w:tcPr>
+            <w:tcW w:w="1240" w:type="dxa"/>
+          </w:tcPr>
+          <w:p/>
+        </w:tc>
+        <w:tc>
+          <w:tcPr>
+            <w:tcW w:w="1390" w:type="dxa"/>
+          </w:tcPr>
+          <w:p/>
+        </w:tc>
+        <w:tc>
+          <w:tcPr>
+            <w:tcW w:w="1390" w:type="dxa"/>
+          </w:tcPr>
+          <w:p/>
+        </w:tc>
+        <w:tc>
+          <w:tcPr>
+            <w:tcW w:w="1154" w:type="dxa"/>
+          </w:tcPr>
+          <w:p/>
+        </w:tc>
+        <w:tc>
+          <w:tcPr>
+            <w:tcW w:w="1545" w:type="dxa"/>
+          </w:tcPr>
+          <w:p/>
+        </w:tc>
+        <w:tc>
+          <w:tcPr>
+            <w:tcW w:w="2060" w:type="dxa"/>
+          </w:tcPr>
+          <w:p/>
+        </w:tc>
+      </w:tr>
+      <w:tr>
+        <w:tc>
+          <w:tcPr>
+            <w:tcW w:w="1496" w:type="dxa"/>
+          </w:tcPr>
+          <w:p>
+            <w:r>
+              <w:t>CNN-BiLSTM</w:t>
+            </w:r>
+          </w:p>
+        </w:tc>
+        <w:tc>
+          <w:tcPr>
+            <w:tcW w:w="1283" w:type="dxa"/>
+          </w:tcPr>
+          <w:p/>
+        </w:tc>
+        <w:tc>
+          <w:tcPr>
+            <w:tcW w:w="1183" w:type="dxa"/>
+          </w:tcPr>
+          <w:p/>
+        </w:tc>
+        <w:tc>
+          <w:tcPr>
+            <w:tcW w:w="1207" w:type="dxa"/>
+          </w:tcPr>
+          <w:p/>
+        </w:tc>
+        <w:tc>
+          <w:tcPr>
+            <w:tcW w:w="1240" w:type="dxa"/>
+          </w:tcPr>
+          <w:p/>
+        </w:tc>
+        <w:tc>
+          <w:tcPr>
+            <w:tcW w:w="1390" w:type="dxa"/>
+          </w:tcPr>
+          <w:p/>
+        </w:tc>
+        <w:tc>
+          <w:tcPr>
+            <w:tcW w:w="1390" w:type="dxa"/>
+          </w:tcPr>
+          <w:p/>
+        </w:tc>
+        <w:tc>
+          <w:tcPr>
+            <w:tcW w:w="1154" w:type="dxa"/>
+          </w:tcPr>
+          <w:p/>
+        </w:tc>
+        <w:tc>
+          <w:tcPr>
+            <w:tcW w:w="1545" w:type="dxa"/>
+          </w:tcPr>
+          <w:p/>
+        </w:tc>
+        <w:tc>
+          <w:tcPr>
+            <w:tcW w:w="2060" w:type="dxa"/>
+          </w:tcPr>
+          <w:p/>
+        </w:tc>
+      </w:tr>
+      <w:tr>
+        <w:tc>
+          <w:tcPr>
+            <w:tcW w:w="1496" w:type="dxa"/>
+          </w:tcPr>
+          <w:p>
+            <w:r>
+              <w:t>ST-LSTM</w:t>
+            </w:r>
+          </w:p>
+        </w:tc>
+        <w:tc>
+          <w:tcPr>
+            <w:tcW w:w="1283" w:type="dxa"/>
+          </w:tcPr>
+          <w:p/>
+        </w:tc>
+        <w:tc>
+          <w:tcPr>
+            <w:tcW w:w="1183" w:type="dxa"/>
+          </w:tcPr>
+          <w:p/>
+        </w:tc>
+        <w:tc>
+          <w:tcPr>
+            <w:tcW w:w="1207" w:type="dxa"/>
+          </w:tcPr>
+          <w:p/>
+        </w:tc>
+        <w:tc>
+          <w:tcPr>
+            <w:tcW w:w="1240" w:type="dxa"/>
+          </w:tcPr>
+          <w:p/>
+        </w:tc>
+        <w:tc>
+          <w:tcPr>
+            <w:tcW w:w="1390" w:type="dxa"/>
+          </w:tcPr>
+          <w:p/>
+        </w:tc>
+        <w:tc>
+          <w:tcPr>
+            <w:tcW w:w="1390" w:type="dxa"/>
+          </w:tcPr>
+          <w:p/>
+        </w:tc>
+        <w:tc>
+          <w:tcPr>
+            <w:tcW w:w="1154" w:type="dxa"/>
+          </w:tcPr>
+          <w:p/>
+        </w:tc>
+        <w:tc>
+          <w:tcPr>
+            <w:tcW w:w="1545" w:type="dxa"/>
+          </w:tcPr>
+          <w:p/>
+        </w:tc>
+        <w:tc>
+          <w:tcPr>
+            <w:tcW w:w="2060" w:type="dxa"/>
+          </w:tcPr>
+          <w:p/>
+        </w:tc>
+      </w:tr>
+    </w:tbl>
+    <w:p/>
+    <w:p/>
+    <w:p/>
+    <w:p/>
+    <w:p/>
+    <w:tbl>
+      <w:tblPr>
+        <w:tblStyle w:val="TableGrid"/>
+        <w:tblW w:w="0" w:type="auto"/>
+        <w:tblLook w:val="04A0" w:firstRow="1" w:lastRow="0" w:firstColumn="1" w:lastColumn="0" w:noHBand="0" w:noVBand="1"/>
+      </w:tblPr>
+      <w:tblGrid>
+        <w:gridCol w:w="1496"/>
+        <w:gridCol w:w="1283"/>
+        <w:gridCol w:w="1183"/>
+        <w:gridCol w:w="1207"/>
+        <w:gridCol w:w="1240"/>
+        <w:gridCol w:w="1390"/>
+        <w:gridCol w:w="1390"/>
+        <w:gridCol w:w="1154"/>
+        <w:gridCol w:w="1545"/>
+        <w:gridCol w:w="2060"/>
+      </w:tblGrid>
+      <w:tr>
+        <w:tc>
+          <w:tcPr>
+            <w:tcW w:w="13948" w:type="dxa"/>
+            <w:gridSpan w:val="10"/>
+            <w:shd w:val="clear" w:color="auto" w:fill="C1E4F5" w:themeFill="accent1" w:themeFillTint="33"/>
+            <w:vAlign w:val="center"/>
+          </w:tcPr>
+          <w:p>
+            <w:pPr>
+              <w:jc w:val="center"/>
+            </w:pPr>
+            <w:r>
+              <w:lastRenderedPageBreak/>
+              <w:t xml:space="preserve">Lookback Window (Days): </w:t>
+            </w:r>
+            <w:r>
+              <w:t>56</w:t>
+            </w:r>
+            <w:r>
+              <w:t xml:space="preserve">; Forecast Horizon (Days): 7; </w:t>
+            </w:r>
+            <w:r>
+              <w:rPr>
+                <w:b/>
+                <w:bCs/>
+              </w:rPr>
+              <w:t>NOT</w:t>
+            </w:r>
+            <w:r>
+              <w:t xml:space="preserve"> include MCO; </w:t>
+            </w:r>
+            <w:r>
+              <w:rPr>
+                <w:b/>
+                <w:bCs/>
+              </w:rPr>
+              <w:t xml:space="preserve">NO </w:t>
+            </w:r>
+            <w:r>
+              <w:t>fine-tuning</w:t>
+            </w:r>
+          </w:p>
+        </w:tc>
+      </w:tr>
+      <w:tr>
+        <w:tc>
+          <w:tcPr>
+            <w:tcW w:w="13948" w:type="dxa"/>
+            <w:gridSpan w:val="10"/>
+            <w:shd w:val="clear" w:color="auto" w:fill="DAE9F7" w:themeFill="text2" w:themeFillTint="1A"/>
+            <w:vAlign w:val="center"/>
+          </w:tcPr>
+          <w:p>
+            <w:pPr>
+              <w:jc w:val="center"/>
+            </w:pPr>
+            <w:r>
+              <w:t>Graph-based Models</w:t>
+            </w:r>
+          </w:p>
+        </w:tc>
+      </w:tr>
+      <w:tr>
+        <w:tc>
+          <w:tcPr>
+            <w:tcW w:w="1496" w:type="dxa"/>
+            <w:vMerge w:val="restart"/>
+            <w:shd w:val="clear" w:color="auto" w:fill="D1D1D1" w:themeFill="background2" w:themeFillShade="E6"/>
+            <w:vAlign w:val="center"/>
+          </w:tcPr>
+          <w:p>
+            <w:pPr>
+              <w:jc w:val="center"/>
+              <w:rPr>
+                <w:b/>
+                <w:bCs/>
+              </w:rPr>
+            </w:pPr>
+            <w:r>
+              <w:rPr>
+                <w:b/>
+                <w:bCs/>
+              </w:rPr>
+              <w:t>Models</w:t>
+            </w:r>
+          </w:p>
+        </w:tc>
+        <w:tc>
+          <w:tcPr>
+            <w:tcW w:w="1283" w:type="dxa"/>
+            <w:vMerge w:val="restart"/>
+            <w:shd w:val="clear" w:color="auto" w:fill="D1D1D1" w:themeFill="background2" w:themeFillShade="E6"/>
+            <w:vAlign w:val="center"/>
+          </w:tcPr>
+          <w:p>
+            <w:pPr>
+              <w:jc w:val="center"/>
+              <w:rPr>
+                <w:b/>
+                <w:bCs/>
+              </w:rPr>
+            </w:pPr>
+            <w:r>
+              <w:rPr>
+                <w:b/>
+                <w:bCs/>
+              </w:rPr>
+              <w:t>Combined</w:t>
+            </w:r>
+          </w:p>
+        </w:tc>
+        <w:tc>
+          <w:tcPr>
+            <w:tcW w:w="1183" w:type="dxa"/>
+            <w:vMerge w:val="restart"/>
+            <w:shd w:val="clear" w:color="auto" w:fill="D1D1D1" w:themeFill="background2" w:themeFillShade="E6"/>
+            <w:vAlign w:val="center"/>
+          </w:tcPr>
+          <w:p>
+            <w:pPr>
+              <w:jc w:val="center"/>
+              <w:rPr>
+                <w:b/>
+                <w:bCs/>
+              </w:rPr>
+            </w:pPr>
+            <w:r>
+              <w:rPr>
+                <w:b/>
+                <w:bCs/>
+              </w:rPr>
+              <w:t>MAPE</w:t>
+            </w:r>
+          </w:p>
+        </w:tc>
+        <w:tc>
+          <w:tcPr>
+            <w:tcW w:w="1207" w:type="dxa"/>
+            <w:vMerge w:val="restart"/>
+            <w:shd w:val="clear" w:color="auto" w:fill="D1D1D1" w:themeFill="background2" w:themeFillShade="E6"/>
+            <w:vAlign w:val="center"/>
+          </w:tcPr>
+          <w:p>
+            <w:pPr>
+              <w:jc w:val="center"/>
+              <w:rPr>
+                <w:b/>
+                <w:bCs/>
+              </w:rPr>
+            </w:pPr>
+            <w:r>
+              <w:rPr>
+                <w:b/>
+                <w:bCs/>
+              </w:rPr>
+              <w:t>MAE%</w:t>
+            </w:r>
+          </w:p>
+        </w:tc>
+        <w:tc>
+          <w:tcPr>
+            <w:tcW w:w="1240" w:type="dxa"/>
+            <w:vMerge w:val="restart"/>
+            <w:shd w:val="clear" w:color="auto" w:fill="D1D1D1" w:themeFill="background2" w:themeFillShade="E6"/>
+            <w:vAlign w:val="center"/>
+          </w:tcPr>
+          <w:p>
+            <w:pPr>
+              <w:jc w:val="center"/>
+              <w:rPr>
+                <w:b/>
+                <w:bCs/>
+              </w:rPr>
+            </w:pPr>
+            <w:r>
+              <w:rPr>
+                <w:b/>
+                <w:bCs/>
+              </w:rPr>
+              <w:t>RMSE%</w:t>
+            </w:r>
+          </w:p>
+        </w:tc>
+        <w:tc>
+          <w:tcPr>
+            <w:tcW w:w="1390" w:type="dxa"/>
+            <w:vMerge w:val="restart"/>
+            <w:shd w:val="clear" w:color="auto" w:fill="D1D1D1" w:themeFill="background2" w:themeFillShade="E6"/>
+            <w:vAlign w:val="center"/>
+          </w:tcPr>
+          <w:p>
+            <w:pPr>
+              <w:jc w:val="center"/>
+              <w:rPr>
+                <w:b/>
+                <w:bCs/>
+              </w:rPr>
+            </w:pPr>
+            <w:r>
+              <w:rPr>
+                <w:b/>
+                <w:bCs/>
+              </w:rPr>
+              <w:t>MAE (Ridership)</w:t>
+            </w:r>
+          </w:p>
+        </w:tc>
+        <w:tc>
+          <w:tcPr>
+            <w:tcW w:w="1390" w:type="dxa"/>
+            <w:vMerge w:val="restart"/>
+            <w:shd w:val="clear" w:color="auto" w:fill="D1D1D1" w:themeFill="background2" w:themeFillShade="E6"/>
+            <w:vAlign w:val="center"/>
+          </w:tcPr>
+          <w:p>
+            <w:pPr>
+              <w:jc w:val="center"/>
+              <w:rPr>
+                <w:b/>
+                <w:bCs/>
+              </w:rPr>
+            </w:pPr>
+            <w:r>
+              <w:rPr>
+                <w:b/>
+                <w:bCs/>
+              </w:rPr>
+              <w:t>RMSE (Ridership)</w:t>
+            </w:r>
+          </w:p>
+        </w:tc>
+        <w:tc>
+          <w:tcPr>
+            <w:tcW w:w="1154" w:type="dxa"/>
+            <w:vMerge w:val="restart"/>
+            <w:shd w:val="clear" w:color="auto" w:fill="D1D1D1" w:themeFill="background2" w:themeFillShade="E6"/>
+            <w:vAlign w:val="center"/>
+          </w:tcPr>
+          <w:p>
+            <w:pPr>
+              <w:jc w:val="center"/>
+              <w:rPr>
+                <w:b/>
+                <w:bCs/>
+                <w:vertAlign w:val="superscript"/>
+              </w:rPr>
+            </w:pPr>
+            <w:r>
+              <w:rPr>
+                <w:b/>
+                <w:bCs/>
+              </w:rPr>
+              <w:t>R</w:t>
+            </w:r>
+            <w:r>
+              <w:rPr>
+                <w:b/>
+                <w:bCs/>
+                <w:vertAlign w:val="superscript"/>
+              </w:rPr>
+              <w:t>2</w:t>
+            </w:r>
+          </w:p>
+        </w:tc>
+        <w:tc>
+          <w:tcPr>
+            <w:tcW w:w="3605" w:type="dxa"/>
+            <w:gridSpan w:val="2"/>
+            <w:shd w:val="clear" w:color="auto" w:fill="D1D1D1" w:themeFill="background2" w:themeFillShade="E6"/>
+            <w:vAlign w:val="center"/>
+          </w:tcPr>
+          <w:p>
+            <w:pPr>
+              <w:jc w:val="center"/>
+              <w:rPr>
+                <w:b/>
+                <w:bCs/>
+              </w:rPr>
+            </w:pPr>
+            <w:r>
+              <w:rPr>
+                <w:b/>
+                <w:bCs/>
+              </w:rPr>
+              <w:t>Differences to Naïve Persistence</w:t>
+            </w:r>
+          </w:p>
+        </w:tc>
+      </w:tr>
+      <w:tr>
+        <w:tc>
+          <w:tcPr>
+            <w:tcW w:w="1496" w:type="dxa"/>
+            <w:vMerge/>
+            <w:shd w:val="clear" w:color="auto" w:fill="D1D1D1" w:themeFill="background2" w:themeFillShade="E6"/>
+          </w:tcPr>
+          <w:p>
+            <w:pPr>
+              <w:rPr>
+                <w:b/>
+                <w:bCs/>
+              </w:rPr>
+            </w:pPr>
+          </w:p>
+        </w:tc>
+        <w:tc>
+          <w:tcPr>
+            <w:tcW w:w="1283" w:type="dxa"/>
+            <w:vMerge/>
+            <w:shd w:val="clear" w:color="auto" w:fill="D1D1D1" w:themeFill="background2" w:themeFillShade="E6"/>
+          </w:tcPr>
+          <w:p>
+            <w:pPr>
+              <w:rPr>
+                <w:b/>
+                <w:bCs/>
+              </w:rPr>
+            </w:pPr>
+          </w:p>
+        </w:tc>
+        <w:tc>
+          <w:tcPr>
+            <w:tcW w:w="1183" w:type="dxa"/>
+            <w:vMerge/>
+            <w:shd w:val="clear" w:color="auto" w:fill="D1D1D1" w:themeFill="background2" w:themeFillShade="E6"/>
+          </w:tcPr>
+          <w:p>
+            <w:pPr>
+              <w:rPr>
+                <w:b/>
+                <w:bCs/>
+              </w:rPr>
+            </w:pPr>
+          </w:p>
+        </w:tc>
+        <w:tc>
+          <w:tcPr>
+            <w:tcW w:w="1207" w:type="dxa"/>
+            <w:vMerge/>
+            <w:shd w:val="clear" w:color="auto" w:fill="D1D1D1" w:themeFill="background2" w:themeFillShade="E6"/>
+          </w:tcPr>
+          <w:p>
+            <w:pPr>
+              <w:rPr>
+                <w:b/>
+                <w:bCs/>
+              </w:rPr>
+            </w:pPr>
+          </w:p>
+        </w:tc>
+        <w:tc>
+          <w:tcPr>
+            <w:tcW w:w="1240" w:type="dxa"/>
+            <w:vMerge/>
+            <w:shd w:val="clear" w:color="auto" w:fill="D1D1D1" w:themeFill="background2" w:themeFillShade="E6"/>
+          </w:tcPr>
+          <w:p>
+            <w:pPr>
+              <w:rPr>
+                <w:b/>
+                <w:bCs/>
+              </w:rPr>
+            </w:pPr>
+          </w:p>
+        </w:tc>
+        <w:tc>
+          <w:tcPr>
+            <w:tcW w:w="1390" w:type="dxa"/>
+            <w:vMerge/>
+            <w:shd w:val="clear" w:color="auto" w:fill="D1D1D1" w:themeFill="background2" w:themeFillShade="E6"/>
+          </w:tcPr>
+          <w:p>
+            <w:pPr>
+              <w:rPr>
+                <w:b/>
+                <w:bCs/>
+              </w:rPr>
+            </w:pPr>
+          </w:p>
+        </w:tc>
+        <w:tc>
+          <w:tcPr>
+            <w:tcW w:w="1390" w:type="dxa"/>
+            <w:vMerge/>
+            <w:shd w:val="clear" w:color="auto" w:fill="D1D1D1" w:themeFill="background2" w:themeFillShade="E6"/>
+          </w:tcPr>
+          <w:p>
+            <w:pPr>
+              <w:rPr>
+                <w:b/>
+                <w:bCs/>
+              </w:rPr>
+            </w:pPr>
+          </w:p>
+        </w:tc>
+        <w:tc>
+          <w:tcPr>
+            <w:tcW w:w="1154" w:type="dxa"/>
+            <w:vMerge/>
+            <w:shd w:val="clear" w:color="auto" w:fill="D1D1D1" w:themeFill="background2" w:themeFillShade="E6"/>
+          </w:tcPr>
+          <w:p>
+            <w:pPr>
+              <w:rPr>
+                <w:b/>
+                <w:bCs/>
+              </w:rPr>
+            </w:pPr>
+          </w:p>
+        </w:tc>
+        <w:tc>
+          <w:tcPr>
+            <w:tcW w:w="1545" w:type="dxa"/>
+            <w:shd w:val="clear" w:color="auto" w:fill="D1D1D1" w:themeFill="background2" w:themeFillShade="E6"/>
+            <w:vAlign w:val="center"/>
+          </w:tcPr>
+          <w:p>
+            <w:pPr>
+              <w:jc w:val="center"/>
+              <w:rPr>
+                <w:b/>
+                <w:bCs/>
+              </w:rPr>
+            </w:pPr>
+            <w:r>
+              <w:rPr>
+                <w:b/>
+                <w:bCs/>
+              </w:rPr>
+              <w:t>Combined</w:t>
+            </w:r>
+          </w:p>
+        </w:tc>
+        <w:tc>
+          <w:tcPr>
+            <w:tcW w:w="2060" w:type="dxa"/>
+            <w:shd w:val="clear" w:color="auto" w:fill="D1D1D1" w:themeFill="background2" w:themeFillShade="E6"/>
+            <w:vAlign w:val="center"/>
+          </w:tcPr>
+          <w:p>
+            <w:pPr>
+              <w:jc w:val="center"/>
+              <w:rPr>
+                <w:b/>
+                <w:bCs/>
+                <w:vertAlign w:val="superscript"/>
+              </w:rPr>
+            </w:pPr>
+            <w:r>
+              <w:rPr>
+                <w:b/>
+                <w:bCs/>
+              </w:rPr>
+              <w:t>MAPE</w:t>
+            </w:r>
+          </w:p>
+        </w:tc>
+      </w:tr>
+      <w:tr>
+        <w:tc>
+          <w:tcPr>
+            <w:tcW w:w="1496" w:type="dxa"/>
+          </w:tcPr>
+          <w:p>
+            <w:r>
+              <w:t>STGCN</w:t>
+            </w:r>
+          </w:p>
+        </w:tc>
+        <w:tc>
+          <w:tcPr>
+            <w:tcW w:w="1283" w:type="dxa"/>
+          </w:tcPr>
+          <w:p/>
+        </w:tc>
+        <w:tc>
+          <w:tcPr>
+            <w:tcW w:w="1183" w:type="dxa"/>
+          </w:tcPr>
+          <w:p/>
+        </w:tc>
+        <w:tc>
+          <w:tcPr>
+            <w:tcW w:w="1207" w:type="dxa"/>
+          </w:tcPr>
+          <w:p/>
+        </w:tc>
+        <w:tc>
+          <w:tcPr>
+            <w:tcW w:w="1240" w:type="dxa"/>
+          </w:tcPr>
+          <w:p/>
+        </w:tc>
+        <w:tc>
+          <w:tcPr>
+            <w:tcW w:w="1390" w:type="dxa"/>
+          </w:tcPr>
+          <w:p/>
+        </w:tc>
+        <w:tc>
+          <w:tcPr>
+            <w:tcW w:w="1390" w:type="dxa"/>
+          </w:tcPr>
+          <w:p/>
+        </w:tc>
+        <w:tc>
+          <w:tcPr>
+            <w:tcW w:w="1154" w:type="dxa"/>
+          </w:tcPr>
+          <w:p/>
+        </w:tc>
+        <w:tc>
+          <w:tcPr>
+            <w:tcW w:w="1545" w:type="dxa"/>
+          </w:tcPr>
+          <w:p/>
+        </w:tc>
+        <w:tc>
+          <w:tcPr>
+            <w:tcW w:w="2060" w:type="dxa"/>
+          </w:tcPr>
+          <w:p/>
+        </w:tc>
+      </w:tr>
+      <w:tr>
+        <w:tc>
+          <w:tcPr>
+            <w:tcW w:w="1496" w:type="dxa"/>
+          </w:tcPr>
+          <w:p>
+            <w:r>
+              <w:t>ST-SGCN</w:t>
+            </w:r>
+          </w:p>
+        </w:tc>
+        <w:tc>
+          <w:tcPr>
+            <w:tcW w:w="1283" w:type="dxa"/>
+          </w:tcPr>
+          <w:p/>
+        </w:tc>
+        <w:tc>
+          <w:tcPr>
+            <w:tcW w:w="1183" w:type="dxa"/>
+          </w:tcPr>
+          <w:p/>
+        </w:tc>
+        <w:tc>
+          <w:tcPr>
+            <w:tcW w:w="1207" w:type="dxa"/>
+          </w:tcPr>
+          <w:p/>
+        </w:tc>
+        <w:tc>
+          <w:tcPr>
+            <w:tcW w:w="1240" w:type="dxa"/>
+          </w:tcPr>
+          <w:p/>
+        </w:tc>
+        <w:tc>
+          <w:tcPr>
+            <w:tcW w:w="1390" w:type="dxa"/>
+          </w:tcPr>
+          <w:p/>
+        </w:tc>
+        <w:tc>
+          <w:tcPr>
+            <w:tcW w:w="1390" w:type="dxa"/>
+          </w:tcPr>
+          <w:p/>
+        </w:tc>
+        <w:tc>
+          <w:tcPr>
+            <w:tcW w:w="1154" w:type="dxa"/>
+          </w:tcPr>
+          <w:p/>
+        </w:tc>
+        <w:tc>
+          <w:tcPr>
+            <w:tcW w:w="1545" w:type="dxa"/>
+          </w:tcPr>
+          <w:p/>
+        </w:tc>
+        <w:tc>
+          <w:tcPr>
+            <w:tcW w:w="2060" w:type="dxa"/>
+          </w:tcPr>
+          <w:p/>
+        </w:tc>
+      </w:tr>
+      <w:tr>
+        <w:tc>
+          <w:tcPr>
+            <w:tcW w:w="1496" w:type="dxa"/>
+          </w:tcPr>
+          <w:p>
+            <w:r>
+              <w:t>STFGNN</w:t>
+            </w:r>
+          </w:p>
+        </w:tc>
+        <w:tc>
+          <w:tcPr>
+            <w:tcW w:w="1283" w:type="dxa"/>
+          </w:tcPr>
+          <w:p/>
+        </w:tc>
+        <w:tc>
+          <w:tcPr>
+            <w:tcW w:w="1183" w:type="dxa"/>
+          </w:tcPr>
+          <w:p/>
+        </w:tc>
+        <w:tc>
+          <w:tcPr>
+            <w:tcW w:w="1207" w:type="dxa"/>
+          </w:tcPr>
+          <w:p/>
+        </w:tc>
+        <w:tc>
+          <w:tcPr>
+            <w:tcW w:w="1240" w:type="dxa"/>
+          </w:tcPr>
+          <w:p/>
+        </w:tc>
+        <w:tc>
+          <w:tcPr>
+            <w:tcW w:w="1390" w:type="dxa"/>
+          </w:tcPr>
+          <w:p/>
+        </w:tc>
+        <w:tc>
+          <w:tcPr>
+            <w:tcW w:w="1390" w:type="dxa"/>
+          </w:tcPr>
+          <w:p/>
+        </w:tc>
+        <w:tc>
+          <w:tcPr>
+            <w:tcW w:w="1154" w:type="dxa"/>
+          </w:tcPr>
+          <w:p/>
+        </w:tc>
+        <w:tc>
+          <w:tcPr>
+            <w:tcW w:w="1545" w:type="dxa"/>
+          </w:tcPr>
+          <w:p/>
+        </w:tc>
+        <w:tc>
+          <w:tcPr>
+            <w:tcW w:w="2060" w:type="dxa"/>
+          </w:tcPr>
+          <w:p/>
+        </w:tc>
+      </w:tr>
+      <w:tr>
+        <w:tc>
+          <w:tcPr>
+            <w:tcW w:w="1496" w:type="dxa"/>
+          </w:tcPr>
+          <w:p>
+            <w:r>
+              <w:t>MTGNN</w:t>
+            </w:r>
+          </w:p>
+        </w:tc>
+        <w:tc>
+          <w:tcPr>
+            <w:tcW w:w="1283" w:type="dxa"/>
+          </w:tcPr>
+          <w:p/>
+        </w:tc>
+        <w:tc>
+          <w:tcPr>
+            <w:tcW w:w="1183" w:type="dxa"/>
+          </w:tcPr>
+          <w:p/>
+        </w:tc>
+        <w:tc>
+          <w:tcPr>
+            <w:tcW w:w="1207" w:type="dxa"/>
+          </w:tcPr>
+          <w:p/>
+        </w:tc>
+        <w:tc>
+          <w:tcPr>
+            <w:tcW w:w="1240" w:type="dxa"/>
+          </w:tcPr>
+          <w:p/>
+        </w:tc>
+        <w:tc>
+          <w:tcPr>
+            <w:tcW w:w="1390" w:type="dxa"/>
+          </w:tcPr>
+          <w:p/>
+        </w:tc>
+        <w:tc>
+          <w:tcPr>
+            <w:tcW w:w="1390" w:type="dxa"/>
+          </w:tcPr>
+          <w:p/>
+        </w:tc>
+        <w:tc>
+          <w:tcPr>
+            <w:tcW w:w="1154" w:type="dxa"/>
+          </w:tcPr>
+          <w:p/>
+        </w:tc>
+        <w:tc>
+          <w:tcPr>
+            <w:tcW w:w="1545" w:type="dxa"/>
+          </w:tcPr>
+          <w:p/>
+        </w:tc>
+        <w:tc>
+          <w:tcPr>
+            <w:tcW w:w="2060" w:type="dxa"/>
+          </w:tcPr>
+          <w:p/>
+        </w:tc>
+      </w:tr>
+      <w:tr>
+        <w:tc>
+          <w:tcPr>
+            <w:tcW w:w="1496" w:type="dxa"/>
+          </w:tcPr>
+          <w:p>
+            <w:r>
+              <w:t>PDR-STGCN</w:t>
+            </w:r>
+          </w:p>
+        </w:tc>
+        <w:tc>
+          <w:tcPr>
+            <w:tcW w:w="1283" w:type="dxa"/>
+          </w:tcPr>
+          <w:p/>
+        </w:tc>
+        <w:tc>
+          <w:tcPr>
+            <w:tcW w:w="1183" w:type="dxa"/>
+          </w:tcPr>
+          <w:p/>
+        </w:tc>
+        <w:tc>
+          <w:tcPr>
+            <w:tcW w:w="1207" w:type="dxa"/>
+          </w:tcPr>
+          <w:p/>
+        </w:tc>
+        <w:tc>
+          <w:tcPr>
+            <w:tcW w:w="1240" w:type="dxa"/>
+          </w:tcPr>
+          <w:p/>
+        </w:tc>
+        <w:tc>
+          <w:tcPr>
+            <w:tcW w:w="1390" w:type="dxa"/>
+          </w:tcPr>
+          <w:p/>
+        </w:tc>
+        <w:tc>
+          <w:tcPr>
+            <w:tcW w:w="1390" w:type="dxa"/>
+          </w:tcPr>
+          <w:p/>
+        </w:tc>
+        <w:tc>
+          <w:tcPr>
+            <w:tcW w:w="1154" w:type="dxa"/>
+          </w:tcPr>
+          <w:p/>
+        </w:tc>
+        <w:tc>
+          <w:tcPr>
+            <w:tcW w:w="1545" w:type="dxa"/>
+          </w:tcPr>
+          <w:p/>
+        </w:tc>
+        <w:tc>
+          <w:tcPr>
+            <w:tcW w:w="2060" w:type="dxa"/>
+          </w:tcPr>
+          <w:p/>
+        </w:tc>
+      </w:tr>
+    </w:tbl>
+    <w:p/>
+    <w:tbl>
+      <w:tblPr>
+        <w:tblStyle w:val="TableGrid"/>
+        <w:tblW w:w="0" w:type="auto"/>
+        <w:tblLook w:val="04A0" w:firstRow="1" w:lastRow="0" w:firstColumn="1" w:lastColumn="0" w:noHBand="0" w:noVBand="1"/>
+      </w:tblPr>
+      <w:tblGrid>
+        <w:gridCol w:w="1496"/>
+        <w:gridCol w:w="1283"/>
+        <w:gridCol w:w="1183"/>
+        <w:gridCol w:w="1207"/>
+        <w:gridCol w:w="1240"/>
+        <w:gridCol w:w="1390"/>
+        <w:gridCol w:w="1390"/>
+        <w:gridCol w:w="1154"/>
+        <w:gridCol w:w="1545"/>
+        <w:gridCol w:w="2060"/>
+      </w:tblGrid>
+      <w:tr>
+        <w:tc>
+          <w:tcPr>
+            <w:tcW w:w="13948" w:type="dxa"/>
+            <w:gridSpan w:val="10"/>
+            <w:shd w:val="clear" w:color="auto" w:fill="C1E4F5" w:themeFill="accent1" w:themeFillTint="33"/>
+            <w:vAlign w:val="center"/>
+          </w:tcPr>
+          <w:p>
+            <w:pPr>
+              <w:jc w:val="center"/>
+            </w:pPr>
+            <w:r>
+              <w:t xml:space="preserve">Lookback Window (Days): </w:t>
+            </w:r>
+            <w:r>
+              <w:t>56</w:t>
             </w:r>
             <w:r>
               <w:t xml:space="preserve">; Forecast Horizon (Days): 7; </w:t>
@@ -6360,6 +8291,7 @@
   <w:style w:type="character" w:default="1" w:styleId="DefaultParagraphFont">
     <w:name w:val="Default Paragraph Font"/>
     <w:uiPriority w:val="1"/>
+    <w:semiHidden/>
     <w:unhideWhenUsed/>
   </w:style>
   <w:style w:type="table" w:default="1" w:styleId="TableNormal">

</xml_diff>

<commit_message>
Done results, no fine-tuning, no MCO, lookback 14, 28, 56 for spatio-temporal
</commit_message>
<xml_diff>
--- a/docs/result.docx
+++ b/docs/result.docx
@@ -124,7 +124,14 @@
                 <w:b/>
                 <w:bCs/>
               </w:rPr>
-              <w:t>Combined</w:t>
+              <w:t>Combine</w:t>
+            </w:r>
+            <w:r>
+              <w:rPr>
+                <w:b/>
+                <w:bCs/>
+              </w:rPr>
+              <w:t>d</w:t>
             </w:r>
           </w:p>
         </w:tc>
@@ -511,55 +518,91 @@
           <w:tcPr>
             <w:tcW w:w="1283" w:type="dxa"/>
           </w:tcPr>
-          <w:p/>
+          <w:p>
+            <w:r>
+              <w:t>73.42</w:t>
+            </w:r>
+          </w:p>
         </w:tc>
         <w:tc>
           <w:tcPr>
             <w:tcW w:w="1183" w:type="dxa"/>
           </w:tcPr>
-          <w:p/>
+          <w:p>
+            <w:r>
+              <w:t>8.32</w:t>
+            </w:r>
+          </w:p>
         </w:tc>
         <w:tc>
           <w:tcPr>
             <w:tcW w:w="1207" w:type="dxa"/>
           </w:tcPr>
-          <w:p/>
+          <w:p>
+            <w:r>
+              <w:t>8.07</w:t>
+            </w:r>
+          </w:p>
         </w:tc>
         <w:tc>
           <w:tcPr>
             <w:tcW w:w="1240" w:type="dxa"/>
           </w:tcPr>
-          <w:p/>
-        </w:tc>
-        <w:tc>
-          <w:tcPr>
-            <w:tcW w:w="1390" w:type="dxa"/>
-          </w:tcPr>
-          <w:p/>
-        </w:tc>
-        <w:tc>
-          <w:tcPr>
-            <w:tcW w:w="1390" w:type="dxa"/>
-          </w:tcPr>
-          <w:p/>
+          <w:p>
+            <w:r>
+              <w:t>10.19</w:t>
+            </w:r>
+          </w:p>
+        </w:tc>
+        <w:tc>
+          <w:tcPr>
+            <w:tcW w:w="1390" w:type="dxa"/>
+          </w:tcPr>
+          <w:p>
+            <w:r>
+              <w:t>101,433</w:t>
+            </w:r>
+          </w:p>
+        </w:tc>
+        <w:tc>
+          <w:tcPr>
+            <w:tcW w:w="1390" w:type="dxa"/>
+          </w:tcPr>
+          <w:p>
+            <w:r>
+              <w:t>128,060</w:t>
+            </w:r>
+          </w:p>
         </w:tc>
         <w:tc>
           <w:tcPr>
             <w:tcW w:w="1154" w:type="dxa"/>
           </w:tcPr>
-          <w:p/>
+          <w:p>
+            <w:r>
+              <w:t>0.6909</w:t>
+            </w:r>
+          </w:p>
         </w:tc>
         <w:tc>
           <w:tcPr>
             <w:tcW w:w="1545" w:type="dxa"/>
           </w:tcPr>
-          <w:p/>
+          <w:p>
+            <w:r>
+              <w:t>+38.59</w:t>
+            </w:r>
+          </w:p>
         </w:tc>
         <w:tc>
           <w:tcPr>
             <w:tcW w:w="2060" w:type="dxa"/>
           </w:tcPr>
-          <w:p/>
+          <w:p>
+            <w:r>
+              <w:t>+12.58</w:t>
+            </w:r>
+          </w:p>
         </w:tc>
       </w:tr>
       <w:tr>
@@ -577,55 +620,91 @@
           <w:tcPr>
             <w:tcW w:w="1283" w:type="dxa"/>
           </w:tcPr>
-          <w:p/>
+          <w:p>
+            <w:r>
+              <w:t>75.06</w:t>
+            </w:r>
+          </w:p>
         </w:tc>
         <w:tc>
           <w:tcPr>
             <w:tcW w:w="1183" w:type="dxa"/>
           </w:tcPr>
-          <w:p/>
+          <w:p>
+            <w:r>
+              <w:t>7.85</w:t>
+            </w:r>
+          </w:p>
         </w:tc>
         <w:tc>
           <w:tcPr>
             <w:tcW w:w="1207" w:type="dxa"/>
           </w:tcPr>
-          <w:p/>
+          <w:p>
+            <w:r>
+              <w:t>7.57</w:t>
+            </w:r>
+          </w:p>
         </w:tc>
         <w:tc>
           <w:tcPr>
             <w:tcW w:w="1240" w:type="dxa"/>
           </w:tcPr>
-          <w:p/>
-        </w:tc>
-        <w:tc>
-          <w:tcPr>
-            <w:tcW w:w="1390" w:type="dxa"/>
-          </w:tcPr>
-          <w:p/>
-        </w:tc>
-        <w:tc>
-          <w:tcPr>
-            <w:tcW w:w="1390" w:type="dxa"/>
-          </w:tcPr>
-          <w:p/>
+          <w:p>
+            <w:r>
+              <w:t>9.51</w:t>
+            </w:r>
+          </w:p>
+        </w:tc>
+        <w:tc>
+          <w:tcPr>
+            <w:tcW w:w="1390" w:type="dxa"/>
+          </w:tcPr>
+          <w:p>
+            <w:r>
+              <w:t>95,164</w:t>
+            </w:r>
+          </w:p>
+        </w:tc>
+        <w:tc>
+          <w:tcPr>
+            <w:tcW w:w="1390" w:type="dxa"/>
+          </w:tcPr>
+          <w:p>
+            <w:r>
+              <w:t>119,568</w:t>
+            </w:r>
+          </w:p>
         </w:tc>
         <w:tc>
           <w:tcPr>
             <w:tcW w:w="1154" w:type="dxa"/>
           </w:tcPr>
-          <w:p/>
+          <w:p>
+            <w:r>
+              <w:t>0.7306</w:t>
+            </w:r>
+          </w:p>
         </w:tc>
         <w:tc>
           <w:tcPr>
             <w:tcW w:w="1545" w:type="dxa"/>
           </w:tcPr>
-          <w:p/>
+          <w:p>
+            <w:r>
+              <w:t>+40.23</w:t>
+            </w:r>
+          </w:p>
         </w:tc>
         <w:tc>
           <w:tcPr>
             <w:tcW w:w="2060" w:type="dxa"/>
           </w:tcPr>
-          <w:p/>
+          <w:p>
+            <w:r>
+              <w:t>+13.05</w:t>
+            </w:r>
+          </w:p>
         </w:tc>
       </w:tr>
       <w:tr>
@@ -643,55 +722,91 @@
           <w:tcPr>
             <w:tcW w:w="1283" w:type="dxa"/>
           </w:tcPr>
-          <w:p/>
+          <w:p>
+            <w:r>
+              <w:t>70.97</w:t>
+            </w:r>
+          </w:p>
         </w:tc>
         <w:tc>
           <w:tcPr>
             <w:tcW w:w="1183" w:type="dxa"/>
           </w:tcPr>
-          <w:p/>
+          <w:p>
+            <w:r>
+              <w:t>9.08</w:t>
+            </w:r>
+          </w:p>
         </w:tc>
         <w:tc>
           <w:tcPr>
             <w:tcW w:w="1207" w:type="dxa"/>
           </w:tcPr>
-          <w:p/>
+          <w:p>
+            <w:r>
+              <w:t>8.93</w:t>
+            </w:r>
+          </w:p>
         </w:tc>
         <w:tc>
           <w:tcPr>
             <w:tcW w:w="1240" w:type="dxa"/>
           </w:tcPr>
-          <w:p/>
-        </w:tc>
-        <w:tc>
-          <w:tcPr>
-            <w:tcW w:w="1390" w:type="dxa"/>
-          </w:tcPr>
-          <w:p/>
-        </w:tc>
-        <w:tc>
-          <w:tcPr>
-            <w:tcW w:w="1390" w:type="dxa"/>
-          </w:tcPr>
-          <w:p/>
+          <w:p>
+            <w:r>
+              <w:t>11.02</w:t>
+            </w:r>
+          </w:p>
+        </w:tc>
+        <w:tc>
+          <w:tcPr>
+            <w:tcW w:w="1390" w:type="dxa"/>
+          </w:tcPr>
+          <w:p>
+            <w:r>
+              <w:t>112,278</w:t>
+            </w:r>
+          </w:p>
+        </w:tc>
+        <w:tc>
+          <w:tcPr>
+            <w:tcW w:w="1390" w:type="dxa"/>
+          </w:tcPr>
+          <w:p>
+            <w:r>
+              <w:t>138,449</w:t>
+            </w:r>
+          </w:p>
         </w:tc>
         <w:tc>
           <w:tcPr>
             <w:tcW w:w="1154" w:type="dxa"/>
           </w:tcPr>
-          <w:p/>
+          <w:p>
+            <w:r>
+              <w:t>0.6388</w:t>
+            </w:r>
+          </w:p>
         </w:tc>
         <w:tc>
           <w:tcPr>
             <w:tcW w:w="1545" w:type="dxa"/>
           </w:tcPr>
-          <w:p/>
+          <w:p>
+            <w:r>
+              <w:t>+36.14</w:t>
+            </w:r>
+          </w:p>
         </w:tc>
         <w:tc>
           <w:tcPr>
             <w:tcW w:w="2060" w:type="dxa"/>
           </w:tcPr>
-          <w:p/>
+          <w:p>
+            <w:r>
+              <w:t>+11.82</w:t>
+            </w:r>
+          </w:p>
         </w:tc>
       </w:tr>
       <w:tr>
@@ -709,55 +824,91 @@
           <w:tcPr>
             <w:tcW w:w="1283" w:type="dxa"/>
           </w:tcPr>
-          <w:p/>
+          <w:p>
+            <w:r>
+              <w:t>71.39</w:t>
+            </w:r>
+          </w:p>
         </w:tc>
         <w:tc>
           <w:tcPr>
             <w:tcW w:w="1183" w:type="dxa"/>
           </w:tcPr>
-          <w:p/>
+          <w:p>
+            <w:r>
+              <w:t>8.98</w:t>
+            </w:r>
+          </w:p>
         </w:tc>
         <w:tc>
           <w:tcPr>
             <w:tcW w:w="1207" w:type="dxa"/>
           </w:tcPr>
-          <w:p/>
+          <w:p>
+            <w:r>
+              <w:t>8.83</w:t>
+            </w:r>
+          </w:p>
         </w:tc>
         <w:tc>
           <w:tcPr>
             <w:tcW w:w="1240" w:type="dxa"/>
           </w:tcPr>
-          <w:p/>
-        </w:tc>
-        <w:tc>
-          <w:tcPr>
-            <w:tcW w:w="1390" w:type="dxa"/>
-          </w:tcPr>
-          <w:p/>
-        </w:tc>
-        <w:tc>
-          <w:tcPr>
-            <w:tcW w:w="1390" w:type="dxa"/>
-          </w:tcPr>
-          <w:p/>
+          <w:p>
+            <w:r>
+              <w:t>10.80</w:t>
+            </w:r>
+          </w:p>
+        </w:tc>
+        <w:tc>
+          <w:tcPr>
+            <w:tcW w:w="1390" w:type="dxa"/>
+          </w:tcPr>
+          <w:p>
+            <w:r>
+              <w:t>110,982</w:t>
+            </w:r>
+          </w:p>
+        </w:tc>
+        <w:tc>
+          <w:tcPr>
+            <w:tcW w:w="1390" w:type="dxa"/>
+          </w:tcPr>
+          <w:p>
+            <w:r>
+              <w:t>135,744</w:t>
+            </w:r>
+          </w:p>
         </w:tc>
         <w:tc>
           <w:tcPr>
             <w:tcW w:w="1154" w:type="dxa"/>
           </w:tcPr>
-          <w:p/>
+          <w:p>
+            <w:r>
+              <w:t>0.6527</w:t>
+            </w:r>
+          </w:p>
         </w:tc>
         <w:tc>
           <w:tcPr>
             <w:tcW w:w="1545" w:type="dxa"/>
           </w:tcPr>
-          <w:p/>
+          <w:p>
+            <w:r>
+              <w:t>+36.56</w:t>
+            </w:r>
+          </w:p>
         </w:tc>
         <w:tc>
           <w:tcPr>
             <w:tcW w:w="2060" w:type="dxa"/>
           </w:tcPr>
-          <w:p/>
+          <w:p>
+            <w:r>
+              <w:t>+11.92</w:t>
+            </w:r>
+          </w:p>
         </w:tc>
       </w:tr>
       <w:tr>
@@ -775,55 +926,91 @@
           <w:tcPr>
             <w:tcW w:w="1283" w:type="dxa"/>
           </w:tcPr>
-          <w:p/>
+          <w:p>
+            <w:r>
+              <w:t>71.72</w:t>
+            </w:r>
+          </w:p>
         </w:tc>
         <w:tc>
           <w:tcPr>
             <w:tcW w:w="1183" w:type="dxa"/>
           </w:tcPr>
-          <w:p/>
+          <w:p>
+            <w:r>
+              <w:t>8.93</w:t>
+            </w:r>
+          </w:p>
         </w:tc>
         <w:tc>
           <w:tcPr>
             <w:tcW w:w="1207" w:type="dxa"/>
           </w:tcPr>
-          <w:p/>
+          <w:p>
+            <w:r>
+              <w:t>8.78</w:t>
+            </w:r>
+          </w:p>
         </w:tc>
         <w:tc>
           <w:tcPr>
             <w:tcW w:w="1240" w:type="dxa"/>
           </w:tcPr>
-          <w:p/>
-        </w:tc>
-        <w:tc>
-          <w:tcPr>
-            <w:tcW w:w="1390" w:type="dxa"/>
-          </w:tcPr>
-          <w:p/>
-        </w:tc>
-        <w:tc>
-          <w:tcPr>
-            <w:tcW w:w="1390" w:type="dxa"/>
-          </w:tcPr>
-          <w:p/>
+          <w:p>
+            <w:r>
+              <w:t>10.57</w:t>
+            </w:r>
+          </w:p>
+        </w:tc>
+        <w:tc>
+          <w:tcPr>
+            <w:tcW w:w="1390" w:type="dxa"/>
+          </w:tcPr>
+          <w:p>
+            <w:r>
+              <w:t>110,361</w:t>
+            </w:r>
+          </w:p>
+        </w:tc>
+        <w:tc>
+          <w:tcPr>
+            <w:tcW w:w="1390" w:type="dxa"/>
+          </w:tcPr>
+          <w:p>
+            <w:r>
+              <w:t>132,797</w:t>
+            </w:r>
+          </w:p>
         </w:tc>
         <w:tc>
           <w:tcPr>
             <w:tcW w:w="1154" w:type="dxa"/>
           </w:tcPr>
-          <w:p/>
+          <w:p>
+            <w:r>
+              <w:t>0.6676</w:t>
+            </w:r>
+          </w:p>
         </w:tc>
         <w:tc>
           <w:tcPr>
             <w:tcW w:w="1545" w:type="dxa"/>
           </w:tcPr>
-          <w:p/>
+          <w:p>
+            <w:r>
+              <w:t>+36.89</w:t>
+            </w:r>
+          </w:p>
         </w:tc>
         <w:tc>
           <w:tcPr>
             <w:tcW w:w="2060" w:type="dxa"/>
           </w:tcPr>
-          <w:p/>
+          <w:p>
+            <w:r>
+              <w:t>+11.96</w:t>
+            </w:r>
+          </w:p>
         </w:tc>
       </w:tr>
       <w:tr>
@@ -841,55 +1028,91 @@
           <w:tcPr>
             <w:tcW w:w="1283" w:type="dxa"/>
           </w:tcPr>
-          <w:p/>
+          <w:p>
+            <w:r>
+              <w:t>73.19</w:t>
+            </w:r>
+          </w:p>
         </w:tc>
         <w:tc>
           <w:tcPr>
             <w:tcW w:w="1183" w:type="dxa"/>
           </w:tcPr>
-          <w:p/>
+          <w:p>
+            <w:r>
+              <w:t>8.45</w:t>
+            </w:r>
+          </w:p>
         </w:tc>
         <w:tc>
           <w:tcPr>
             <w:tcW w:w="1207" w:type="dxa"/>
           </w:tcPr>
-          <w:p/>
+          <w:p>
+            <w:r>
+              <w:t>8.19</w:t>
+            </w:r>
+          </w:p>
         </w:tc>
         <w:tc>
           <w:tcPr>
             <w:tcW w:w="1240" w:type="dxa"/>
           </w:tcPr>
-          <w:p/>
-        </w:tc>
-        <w:tc>
-          <w:tcPr>
-            <w:tcW w:w="1390" w:type="dxa"/>
-          </w:tcPr>
-          <w:p/>
-        </w:tc>
-        <w:tc>
-          <w:tcPr>
-            <w:tcW w:w="1390" w:type="dxa"/>
-          </w:tcPr>
-          <w:p/>
+          <w:p>
+            <w:r>
+              <w:t>10.17</w:t>
+            </w:r>
+          </w:p>
+        </w:tc>
+        <w:tc>
+          <w:tcPr>
+            <w:tcW w:w="1390" w:type="dxa"/>
+          </w:tcPr>
+          <w:p>
+            <w:r>
+              <w:t>102,924</w:t>
+            </w:r>
+          </w:p>
+        </w:tc>
+        <w:tc>
+          <w:tcPr>
+            <w:tcW w:w="1390" w:type="dxa"/>
+          </w:tcPr>
+          <w:p>
+            <w:r>
+              <w:t>127,824</w:t>
+            </w:r>
+          </w:p>
         </w:tc>
         <w:tc>
           <w:tcPr>
             <w:tcW w:w="1154" w:type="dxa"/>
           </w:tcPr>
-          <w:p/>
+          <w:p>
+            <w:r>
+              <w:t>0.6921</w:t>
+            </w:r>
+          </w:p>
         </w:tc>
         <w:tc>
           <w:tcPr>
             <w:tcW w:w="1545" w:type="dxa"/>
           </w:tcPr>
-          <w:p/>
+          <w:p>
+            <w:r>
+              <w:t>+38.36</w:t>
+            </w:r>
+          </w:p>
         </w:tc>
         <w:tc>
           <w:tcPr>
             <w:tcW w:w="2060" w:type="dxa"/>
           </w:tcPr>
-          <w:p/>
+          <w:p>
+            <w:r>
+              <w:t>+12.45</w:t>
+            </w:r>
+          </w:p>
         </w:tc>
       </w:tr>
       <w:tr>
@@ -907,55 +1130,91 @@
           <w:tcPr>
             <w:tcW w:w="1283" w:type="dxa"/>
           </w:tcPr>
-          <w:p/>
+          <w:p>
+            <w:r>
+              <w:t>74.82</w:t>
+            </w:r>
+          </w:p>
         </w:tc>
         <w:tc>
           <w:tcPr>
             <w:tcW w:w="1183" w:type="dxa"/>
           </w:tcPr>
-          <w:p/>
+          <w:p>
+            <w:r>
+              <w:t>7.95</w:t>
+            </w:r>
+          </w:p>
         </w:tc>
         <w:tc>
           <w:tcPr>
             <w:tcW w:w="1207" w:type="dxa"/>
           </w:tcPr>
-          <w:p/>
+          <w:p>
+            <w:r>
+              <w:t>7.65</w:t>
+            </w:r>
+          </w:p>
         </w:tc>
         <w:tc>
           <w:tcPr>
             <w:tcW w:w="1240" w:type="dxa"/>
           </w:tcPr>
-          <w:p/>
-        </w:tc>
-        <w:tc>
-          <w:tcPr>
-            <w:tcW w:w="1390" w:type="dxa"/>
-          </w:tcPr>
-          <w:p/>
-        </w:tc>
-        <w:tc>
-          <w:tcPr>
-            <w:tcW w:w="1390" w:type="dxa"/>
-          </w:tcPr>
-          <w:p/>
+          <w:p>
+            <w:r>
+              <w:t>9.59</w:t>
+            </w:r>
+          </w:p>
+        </w:tc>
+        <w:tc>
+          <w:tcPr>
+            <w:tcW w:w="1390" w:type="dxa"/>
+          </w:tcPr>
+          <w:p>
+            <w:r>
+              <w:t>96,173</w:t>
+            </w:r>
+          </w:p>
+        </w:tc>
+        <w:tc>
+          <w:tcPr>
+            <w:tcW w:w="1390" w:type="dxa"/>
+          </w:tcPr>
+          <w:p>
+            <w:r>
+              <w:t>120,468</w:t>
+            </w:r>
+          </w:p>
         </w:tc>
         <w:tc>
           <w:tcPr>
             <w:tcW w:w="1154" w:type="dxa"/>
           </w:tcPr>
-          <w:p/>
+          <w:p>
+            <w:r>
+              <w:t>0.7265</w:t>
+            </w:r>
+          </w:p>
         </w:tc>
         <w:tc>
           <w:tcPr>
             <w:tcW w:w="1545" w:type="dxa"/>
           </w:tcPr>
-          <w:p/>
+          <w:p>
+            <w:r>
+              <w:t>+39.98</w:t>
+            </w:r>
+          </w:p>
         </w:tc>
         <w:tc>
           <w:tcPr>
             <w:tcW w:w="2060" w:type="dxa"/>
           </w:tcPr>
-          <w:p/>
+          <w:p>
+            <w:r>
+              <w:t>+12.95</w:t>
+            </w:r>
+          </w:p>
         </w:tc>
       </w:tr>
     </w:tbl>
@@ -3055,55 +3314,91 @@
           <w:tcPr>
             <w:tcW w:w="1283" w:type="dxa"/>
           </w:tcPr>
-          <w:p/>
+          <w:p>
+            <w:r>
+              <w:t>74.40</w:t>
+            </w:r>
+          </w:p>
         </w:tc>
         <w:tc>
           <w:tcPr>
             <w:tcW w:w="1183" w:type="dxa"/>
           </w:tcPr>
-          <w:p/>
+          <w:p>
+            <w:r>
+              <w:t>8.13</w:t>
+            </w:r>
+          </w:p>
         </w:tc>
         <w:tc>
           <w:tcPr>
             <w:tcW w:w="1207" w:type="dxa"/>
           </w:tcPr>
-          <w:p/>
+          <w:p>
+            <w:r>
+              <w:t>7.68</w:t>
+            </w:r>
+          </w:p>
         </w:tc>
         <w:tc>
           <w:tcPr>
             <w:tcW w:w="1240" w:type="dxa"/>
           </w:tcPr>
-          <w:p/>
-        </w:tc>
-        <w:tc>
-          <w:tcPr>
-            <w:tcW w:w="1390" w:type="dxa"/>
-          </w:tcPr>
-          <w:p/>
-        </w:tc>
-        <w:tc>
-          <w:tcPr>
-            <w:tcW w:w="1390" w:type="dxa"/>
-          </w:tcPr>
-          <w:p/>
+          <w:p>
+            <w:r>
+              <w:t>9.78</w:t>
+            </w:r>
+          </w:p>
+        </w:tc>
+        <w:tc>
+          <w:tcPr>
+            <w:tcW w:w="1390" w:type="dxa"/>
+          </w:tcPr>
+          <w:p>
+            <w:r>
+              <w:t>96,590</w:t>
+            </w:r>
+          </w:p>
+        </w:tc>
+        <w:tc>
+          <w:tcPr>
+            <w:tcW w:w="1390" w:type="dxa"/>
+          </w:tcPr>
+          <w:p>
+            <w:r>
+              <w:t>123,012</w:t>
+            </w:r>
+          </w:p>
         </w:tc>
         <w:tc>
           <w:tcPr>
             <w:tcW w:w="1154" w:type="dxa"/>
           </w:tcPr>
-          <w:p/>
+          <w:p>
+            <w:r>
+              <w:t>0.7150</w:t>
+            </w:r>
+          </w:p>
         </w:tc>
         <w:tc>
           <w:tcPr>
             <w:tcW w:w="1545" w:type="dxa"/>
           </w:tcPr>
-          <w:p/>
+          <w:p>
+            <w:r>
+              <w:t>+39.76</w:t>
+            </w:r>
+          </w:p>
         </w:tc>
         <w:tc>
           <w:tcPr>
             <w:tcW w:w="2060" w:type="dxa"/>
           </w:tcPr>
-          <w:p/>
+          <w:p>
+            <w:r>
+              <w:t>+12.84</w:t>
+            </w:r>
+          </w:p>
         </w:tc>
       </w:tr>
       <w:tr>
@@ -3121,55 +3416,91 @@
           <w:tcPr>
             <w:tcW w:w="1283" w:type="dxa"/>
           </w:tcPr>
-          <w:p/>
+          <w:p>
+            <w:r>
+              <w:t>73.87</w:t>
+            </w:r>
+          </w:p>
         </w:tc>
         <w:tc>
           <w:tcPr>
             <w:tcW w:w="1183" w:type="dxa"/>
           </w:tcPr>
-          <w:p/>
+          <w:p>
+            <w:r>
+              <w:t>8.16</w:t>
+            </w:r>
+          </w:p>
         </w:tc>
         <w:tc>
           <w:tcPr>
             <w:tcW w:w="1207" w:type="dxa"/>
           </w:tcPr>
-          <w:p/>
+          <w:p>
+            <w:r>
+              <w:t>7.90</w:t>
+            </w:r>
+          </w:p>
         </w:tc>
         <w:tc>
           <w:tcPr>
             <w:tcW w:w="1240" w:type="dxa"/>
           </w:tcPr>
-          <w:p/>
-        </w:tc>
-        <w:tc>
-          <w:tcPr>
-            <w:tcW w:w="1390" w:type="dxa"/>
-          </w:tcPr>
-          <w:p/>
-        </w:tc>
-        <w:tc>
-          <w:tcPr>
-            <w:tcW w:w="1390" w:type="dxa"/>
-          </w:tcPr>
-          <w:p/>
+          <w:p>
+            <w:r>
+              <w:t>10.07</w:t>
+            </w:r>
+          </w:p>
+        </w:tc>
+        <w:tc>
+          <w:tcPr>
+            <w:tcW w:w="1390" w:type="dxa"/>
+          </w:tcPr>
+          <w:p>
+            <w:r>
+              <w:t>99,353</w:t>
+            </w:r>
+          </w:p>
+        </w:tc>
+        <w:tc>
+          <w:tcPr>
+            <w:tcW w:w="1390" w:type="dxa"/>
+          </w:tcPr>
+          <w:p>
+            <w:r>
+              <w:t>126,606</w:t>
+            </w:r>
+          </w:p>
         </w:tc>
         <w:tc>
           <w:tcPr>
             <w:tcW w:w="1154" w:type="dxa"/>
           </w:tcPr>
-          <w:p/>
+          <w:p>
+            <w:r>
+              <w:t>0.6982</w:t>
+            </w:r>
+          </w:p>
         </w:tc>
         <w:tc>
           <w:tcPr>
             <w:tcW w:w="1545" w:type="dxa"/>
           </w:tcPr>
-          <w:p/>
+          <w:p>
+            <w:r>
+              <w:t>+39.23</w:t>
+            </w:r>
+          </w:p>
         </w:tc>
         <w:tc>
           <w:tcPr>
             <w:tcW w:w="2060" w:type="dxa"/>
           </w:tcPr>
-          <w:p/>
+          <w:p>
+            <w:r>
+              <w:t>+12.81</w:t>
+            </w:r>
+          </w:p>
         </w:tc>
       </w:tr>
       <w:tr>
@@ -3187,55 +3518,91 @@
           <w:tcPr>
             <w:tcW w:w="1283" w:type="dxa"/>
           </w:tcPr>
-          <w:p/>
+          <w:p>
+            <w:r>
+              <w:t>73.60</w:t>
+            </w:r>
+          </w:p>
         </w:tc>
         <w:tc>
           <w:tcPr>
             <w:tcW w:w="1183" w:type="dxa"/>
           </w:tcPr>
-          <w:p/>
+          <w:p>
+            <w:r>
+              <w:t>8.25</w:t>
+            </w:r>
+          </w:p>
         </w:tc>
         <w:tc>
           <w:tcPr>
             <w:tcW w:w="1207" w:type="dxa"/>
           </w:tcPr>
-          <w:p/>
+          <w:p>
+            <w:r>
+              <w:t>8.09</w:t>
+            </w:r>
+          </w:p>
         </w:tc>
         <w:tc>
           <w:tcPr>
             <w:tcW w:w="1240" w:type="dxa"/>
           </w:tcPr>
-          <w:p/>
-        </w:tc>
-        <w:tc>
-          <w:tcPr>
-            <w:tcW w:w="1390" w:type="dxa"/>
-          </w:tcPr>
-          <w:p/>
-        </w:tc>
-        <w:tc>
-          <w:tcPr>
-            <w:tcW w:w="1390" w:type="dxa"/>
-          </w:tcPr>
-          <w:p/>
+          <w:p>
+            <w:r>
+              <w:t>10.06</w:t>
+            </w:r>
+          </w:p>
+        </w:tc>
+        <w:tc>
+          <w:tcPr>
+            <w:tcW w:w="1390" w:type="dxa"/>
+          </w:tcPr>
+          <w:p>
+            <w:r>
+              <w:t>101,754</w:t>
+            </w:r>
+          </w:p>
+        </w:tc>
+        <w:tc>
+          <w:tcPr>
+            <w:tcW w:w="1390" w:type="dxa"/>
+          </w:tcPr>
+          <w:p>
+            <w:r>
+              <w:t>126,480</w:t>
+            </w:r>
+          </w:p>
         </w:tc>
         <w:tc>
           <w:tcPr>
             <w:tcW w:w="1154" w:type="dxa"/>
           </w:tcPr>
-          <w:p/>
+          <w:p>
+            <w:r>
+              <w:t>0.6988</w:t>
+            </w:r>
+          </w:p>
         </w:tc>
         <w:tc>
           <w:tcPr>
             <w:tcW w:w="1545" w:type="dxa"/>
           </w:tcPr>
-          <w:p/>
+          <w:p>
+            <w:r>
+              <w:t>+38.96</w:t>
+            </w:r>
+          </w:p>
         </w:tc>
         <w:tc>
           <w:tcPr>
             <w:tcW w:w="2060" w:type="dxa"/>
           </w:tcPr>
-          <w:p/>
+          <w:p>
+            <w:r>
+              <w:t>+12.72</w:t>
+            </w:r>
+          </w:p>
         </w:tc>
       </w:tr>
       <w:tr>
@@ -3253,55 +3620,91 @@
           <w:tcPr>
             <w:tcW w:w="1283" w:type="dxa"/>
           </w:tcPr>
-          <w:p/>
+          <w:p>
+            <w:r>
+              <w:t>74.43</w:t>
+            </w:r>
+          </w:p>
         </w:tc>
         <w:tc>
           <w:tcPr>
             <w:tcW w:w="1183" w:type="dxa"/>
           </w:tcPr>
-          <w:p/>
+          <w:p>
+            <w:r>
+              <w:t>8.06</w:t>
+            </w:r>
+          </w:p>
         </w:tc>
         <w:tc>
           <w:tcPr>
             <w:tcW w:w="1207" w:type="dxa"/>
           </w:tcPr>
-          <w:p/>
+          <w:p>
+            <w:r>
+              <w:t>7.75</w:t>
+            </w:r>
+          </w:p>
         </w:tc>
         <w:tc>
           <w:tcPr>
             <w:tcW w:w="1240" w:type="dxa"/>
           </w:tcPr>
-          <w:p/>
-        </w:tc>
-        <w:tc>
-          <w:tcPr>
-            <w:tcW w:w="1390" w:type="dxa"/>
-          </w:tcPr>
-          <w:p/>
-        </w:tc>
-        <w:tc>
-          <w:tcPr>
-            <w:tcW w:w="1390" w:type="dxa"/>
-          </w:tcPr>
-          <w:p/>
+          <w:p>
+            <w:r>
+              <w:t>9.76</w:t>
+            </w:r>
+          </w:p>
+        </w:tc>
+        <w:tc>
+          <w:tcPr>
+            <w:tcW w:w="1390" w:type="dxa"/>
+          </w:tcPr>
+          <w:p>
+            <w:r>
+              <w:t>97,383</w:t>
+            </w:r>
+          </w:p>
+        </w:tc>
+        <w:tc>
+          <w:tcPr>
+            <w:tcW w:w="1390" w:type="dxa"/>
+          </w:tcPr>
+          <w:p>
+            <w:r>
+              <w:t>122,736</w:t>
+            </w:r>
+          </w:p>
         </w:tc>
         <w:tc>
           <w:tcPr>
             <w:tcW w:w="1154" w:type="dxa"/>
           </w:tcPr>
-          <w:p/>
+          <w:p>
+            <w:r>
+              <w:t>0.7163</w:t>
+            </w:r>
+          </w:p>
         </w:tc>
         <w:tc>
           <w:tcPr>
             <w:tcW w:w="1545" w:type="dxa"/>
           </w:tcPr>
-          <w:p/>
+          <w:p>
+            <w:r>
+              <w:t>+39.79</w:t>
+            </w:r>
+          </w:p>
         </w:tc>
         <w:tc>
           <w:tcPr>
             <w:tcW w:w="2060" w:type="dxa"/>
           </w:tcPr>
-          <w:p/>
+          <w:p>
+            <w:r>
+              <w:t>+12.91</w:t>
+            </w:r>
+          </w:p>
         </w:tc>
       </w:tr>
       <w:tr>
@@ -3319,55 +3722,91 @@
           <w:tcPr>
             <w:tcW w:w="1283" w:type="dxa"/>
           </w:tcPr>
-          <w:p/>
+          <w:p>
+            <w:r>
+              <w:t>73.95</w:t>
+            </w:r>
+          </w:p>
         </w:tc>
         <w:tc>
           <w:tcPr>
             <w:tcW w:w="1183" w:type="dxa"/>
           </w:tcPr>
-          <w:p/>
+          <w:p>
+            <w:r>
+              <w:t>8.21</w:t>
+            </w:r>
+          </w:p>
         </w:tc>
         <w:tc>
           <w:tcPr>
             <w:tcW w:w="1207" w:type="dxa"/>
           </w:tcPr>
-          <w:p/>
+          <w:p>
+            <w:r>
+              <w:t>7.86</w:t>
+            </w:r>
+          </w:p>
         </w:tc>
         <w:tc>
           <w:tcPr>
             <w:tcW w:w="1240" w:type="dxa"/>
           </w:tcPr>
-          <w:p/>
-        </w:tc>
-        <w:tc>
-          <w:tcPr>
-            <w:tcW w:w="1390" w:type="dxa"/>
-          </w:tcPr>
-          <w:p/>
-        </w:tc>
-        <w:tc>
-          <w:tcPr>
-            <w:tcW w:w="1390" w:type="dxa"/>
-          </w:tcPr>
-          <w:p/>
+          <w:p>
+            <w:r>
+              <w:t>9.98</w:t>
+            </w:r>
+          </w:p>
+        </w:tc>
+        <w:tc>
+          <w:tcPr>
+            <w:tcW w:w="1390" w:type="dxa"/>
+          </w:tcPr>
+          <w:p>
+            <w:r>
+              <w:t>98,854</w:t>
+            </w:r>
+          </w:p>
+        </w:tc>
+        <w:tc>
+          <w:tcPr>
+            <w:tcW w:w="1390" w:type="dxa"/>
+          </w:tcPr>
+          <w:p>
+            <w:r>
+              <w:t>125,509</w:t>
+            </w:r>
+          </w:p>
         </w:tc>
         <w:tc>
           <w:tcPr>
             <w:tcW w:w="1154" w:type="dxa"/>
           </w:tcPr>
-          <w:p/>
+          <w:p>
+            <w:r>
+              <w:t>0.7034</w:t>
+            </w:r>
+          </w:p>
         </w:tc>
         <w:tc>
           <w:tcPr>
             <w:tcW w:w="1545" w:type="dxa"/>
           </w:tcPr>
-          <w:p/>
+          <w:p>
+            <w:r>
+              <w:t>+39.31</w:t>
+            </w:r>
+          </w:p>
         </w:tc>
         <w:tc>
           <w:tcPr>
             <w:tcW w:w="2060" w:type="dxa"/>
           </w:tcPr>
-          <w:p/>
+          <w:p>
+            <w:r>
+              <w:t>+12.76</w:t>
+            </w:r>
+          </w:p>
         </w:tc>
       </w:tr>
       <w:tr>
@@ -3385,55 +3824,91 @@
           <w:tcPr>
             <w:tcW w:w="1283" w:type="dxa"/>
           </w:tcPr>
-          <w:p/>
+          <w:p>
+            <w:r>
+              <w:t>67.40</w:t>
+            </w:r>
+          </w:p>
         </w:tc>
         <w:tc>
           <w:tcPr>
             <w:tcW w:w="1183" w:type="dxa"/>
           </w:tcPr>
-          <w:p/>
+          <w:p>
+            <w:r>
+              <w:t>10.21</w:t>
+            </w:r>
+          </w:p>
         </w:tc>
         <w:tc>
           <w:tcPr>
             <w:tcW w:w="1207" w:type="dxa"/>
           </w:tcPr>
-          <w:p/>
+          <w:p>
+            <w:r>
+              <w:t>10.08</w:t>
+            </w:r>
+          </w:p>
         </w:tc>
         <w:tc>
           <w:tcPr>
             <w:tcW w:w="1240" w:type="dxa"/>
           </w:tcPr>
-          <w:p/>
-        </w:tc>
-        <w:tc>
-          <w:tcPr>
-            <w:tcW w:w="1390" w:type="dxa"/>
-          </w:tcPr>
-          <w:p/>
-        </w:tc>
-        <w:tc>
-          <w:tcPr>
-            <w:tcW w:w="1390" w:type="dxa"/>
-          </w:tcPr>
-          <w:p/>
+          <w:p>
+            <w:r>
+              <w:t>12.31</w:t>
+            </w:r>
+          </w:p>
+        </w:tc>
+        <w:tc>
+          <w:tcPr>
+            <w:tcW w:w="1390" w:type="dxa"/>
+          </w:tcPr>
+          <w:p>
+            <w:r>
+              <w:t>126,685</w:t>
+            </w:r>
+          </w:p>
+        </w:tc>
+        <w:tc>
+          <w:tcPr>
+            <w:tcW w:w="1390" w:type="dxa"/>
+          </w:tcPr>
+          <w:p>
+            <w:r>
+              <w:t>154,784</w:t>
+            </w:r>
+          </w:p>
         </w:tc>
         <w:tc>
           <w:tcPr>
             <w:tcW w:w="1154" w:type="dxa"/>
           </w:tcPr>
-          <w:p/>
+          <w:p>
+            <w:r>
+              <w:t>0.5488</w:t>
+            </w:r>
+          </w:p>
         </w:tc>
         <w:tc>
           <w:tcPr>
             <w:tcW w:w="1545" w:type="dxa"/>
           </w:tcPr>
-          <w:p/>
+          <w:p>
+            <w:r>
+              <w:t>+32.76</w:t>
+            </w:r>
+          </w:p>
         </w:tc>
         <w:tc>
           <w:tcPr>
             <w:tcW w:w="2060" w:type="dxa"/>
           </w:tcPr>
-          <w:p/>
+          <w:p>
+            <w:r>
+              <w:t>+10.75</w:t>
+            </w:r>
+          </w:p>
         </w:tc>
       </w:tr>
       <w:tr>
@@ -3451,55 +3926,91 @@
           <w:tcPr>
             <w:tcW w:w="1283" w:type="dxa"/>
           </w:tcPr>
-          <w:p/>
+          <w:p>
+            <w:r>
+              <w:t>73.65</w:t>
+            </w:r>
+          </w:p>
         </w:tc>
         <w:tc>
           <w:tcPr>
             <w:tcW w:w="1183" w:type="dxa"/>
           </w:tcPr>
-          <w:p/>
+          <w:p>
+            <w:r>
+              <w:t>8.29</w:t>
+            </w:r>
+          </w:p>
         </w:tc>
         <w:tc>
           <w:tcPr>
             <w:tcW w:w="1207" w:type="dxa"/>
           </w:tcPr>
-          <w:p/>
+          <w:p>
+            <w:r>
+              <w:t>8.08</w:t>
+            </w:r>
+          </w:p>
         </w:tc>
         <w:tc>
           <w:tcPr>
             <w:tcW w:w="1240" w:type="dxa"/>
           </w:tcPr>
-          <w:p/>
-        </w:tc>
-        <w:tc>
-          <w:tcPr>
-            <w:tcW w:w="1390" w:type="dxa"/>
-          </w:tcPr>
-          <w:p/>
-        </w:tc>
-        <w:tc>
-          <w:tcPr>
-            <w:tcW w:w="1390" w:type="dxa"/>
-          </w:tcPr>
-          <w:p/>
+          <w:p>
+            <w:r>
+              <w:t>9.98</w:t>
+            </w:r>
+          </w:p>
+        </w:tc>
+        <w:tc>
+          <w:tcPr>
+            <w:tcW w:w="1390" w:type="dxa"/>
+          </w:tcPr>
+          <w:p>
+            <w:r>
+              <w:t>101,629</w:t>
+            </w:r>
+          </w:p>
+        </w:tc>
+        <w:tc>
+          <w:tcPr>
+            <w:tcW w:w="1390" w:type="dxa"/>
+          </w:tcPr>
+          <w:p>
+            <w:r>
+              <w:t>125,462</w:t>
+            </w:r>
+          </w:p>
         </w:tc>
         <w:tc>
           <w:tcPr>
             <w:tcW w:w="1154" w:type="dxa"/>
           </w:tcPr>
-          <w:p/>
+          <w:p>
+            <w:r>
+              <w:t>0.7036</w:t>
+            </w:r>
+          </w:p>
         </w:tc>
         <w:tc>
           <w:tcPr>
             <w:tcW w:w="1545" w:type="dxa"/>
           </w:tcPr>
-          <w:p/>
+          <w:p>
+            <w:r>
+              <w:t>+39.01</w:t>
+            </w:r>
+          </w:p>
         </w:tc>
         <w:tc>
           <w:tcPr>
             <w:tcW w:w="2060" w:type="dxa"/>
           </w:tcPr>
-          <w:p/>
+          <w:p>
+            <w:r>
+              <w:t>+12.68</w:t>
+            </w:r>
+          </w:p>
         </w:tc>
       </w:tr>
     </w:tbl>
@@ -5145,13 +5656,7 @@
             </w:pPr>
             <w:r>
               <w:lastRenderedPageBreak/>
-              <w:t xml:space="preserve">Lookback Window (Days): </w:t>
-            </w:r>
-            <w:r>
-              <w:t>56</w:t>
-            </w:r>
-            <w:r>
-              <w:t xml:space="preserve">; Forecast Horizon (Days): 7; </w:t>
+              <w:t xml:space="preserve">Lookback Window (Days): 56; Forecast Horizon (Days): 7; </w:t>
             </w:r>
             <w:r>
               <w:rPr>
@@ -5605,55 +6110,91 @@
           <w:tcPr>
             <w:tcW w:w="1283" w:type="dxa"/>
           </w:tcPr>
-          <w:p/>
+          <w:p>
+            <w:r>
+              <w:t>72.27</w:t>
+            </w:r>
+          </w:p>
         </w:tc>
         <w:tc>
           <w:tcPr>
             <w:tcW w:w="1183" w:type="dxa"/>
           </w:tcPr>
-          <w:p/>
+          <w:p>
+            <w:r>
+              <w:t>8.76</w:t>
+            </w:r>
+          </w:p>
         </w:tc>
         <w:tc>
           <w:tcPr>
             <w:tcW w:w="1207" w:type="dxa"/>
           </w:tcPr>
-          <w:p/>
+          <w:p>
+            <w:r>
+              <w:t>8.46</w:t>
+            </w:r>
+          </w:p>
         </w:tc>
         <w:tc>
           <w:tcPr>
             <w:tcW w:w="1240" w:type="dxa"/>
           </w:tcPr>
-          <w:p/>
-        </w:tc>
-        <w:tc>
-          <w:tcPr>
-            <w:tcW w:w="1390" w:type="dxa"/>
-          </w:tcPr>
-          <w:p/>
-        </w:tc>
-        <w:tc>
-          <w:tcPr>
-            <w:tcW w:w="1390" w:type="dxa"/>
-          </w:tcPr>
-          <w:p/>
+          <w:p>
+            <w:r>
+              <w:t>10.51</w:t>
+            </w:r>
+          </w:p>
+        </w:tc>
+        <w:tc>
+          <w:tcPr>
+            <w:tcW w:w="1390" w:type="dxa"/>
+          </w:tcPr>
+          <w:p>
+            <w:r>
+              <w:t>106,247</w:t>
+            </w:r>
+          </w:p>
+        </w:tc>
+        <w:tc>
+          <w:tcPr>
+            <w:tcW w:w="1390" w:type="dxa"/>
+          </w:tcPr>
+          <w:p>
+            <w:r>
+              <w:t>131,946</w:t>
+            </w:r>
+          </w:p>
         </w:tc>
         <w:tc>
           <w:tcPr>
             <w:tcW w:w="1154" w:type="dxa"/>
           </w:tcPr>
-          <w:p/>
+          <w:p>
+            <w:r>
+              <w:t>0.6678</w:t>
+            </w:r>
+          </w:p>
         </w:tc>
         <w:tc>
           <w:tcPr>
             <w:tcW w:w="1545" w:type="dxa"/>
           </w:tcPr>
-          <w:p/>
+          <w:p>
+            <w:r>
+              <w:t>+37.28</w:t>
+            </w:r>
+          </w:p>
         </w:tc>
         <w:tc>
           <w:tcPr>
             <w:tcW w:w="2060" w:type="dxa"/>
           </w:tcPr>
-          <w:p/>
+          <w:p>
+            <w:r>
+              <w:t>+12.11</w:t>
+            </w:r>
+          </w:p>
         </w:tc>
       </w:tr>
       <w:tr>
@@ -5671,55 +6212,91 @@
           <w:tcPr>
             <w:tcW w:w="1283" w:type="dxa"/>
           </w:tcPr>
-          <w:p/>
+          <w:p>
+            <w:r>
+              <w:t>73.22</w:t>
+            </w:r>
+          </w:p>
         </w:tc>
         <w:tc>
           <w:tcPr>
             <w:tcW w:w="1183" w:type="dxa"/>
           </w:tcPr>
-          <w:p/>
+          <w:p>
+            <w:r>
+              <w:t>8.49</w:t>
+            </w:r>
+          </w:p>
         </w:tc>
         <w:tc>
           <w:tcPr>
             <w:tcW w:w="1207" w:type="dxa"/>
           </w:tcPr>
-          <w:p/>
+          <w:p>
+            <w:r>
+              <w:t>8.10</w:t>
+            </w:r>
+          </w:p>
         </w:tc>
         <w:tc>
           <w:tcPr>
             <w:tcW w:w="1240" w:type="dxa"/>
           </w:tcPr>
-          <w:p/>
-        </w:tc>
-        <w:tc>
-          <w:tcPr>
-            <w:tcW w:w="1390" w:type="dxa"/>
-          </w:tcPr>
-          <w:p/>
-        </w:tc>
-        <w:tc>
-          <w:tcPr>
-            <w:tcW w:w="1390" w:type="dxa"/>
-          </w:tcPr>
-          <w:p/>
+          <w:p>
+            <w:r>
+              <w:t>10.19</w:t>
+            </w:r>
+          </w:p>
+        </w:tc>
+        <w:tc>
+          <w:tcPr>
+            <w:tcW w:w="1390" w:type="dxa"/>
+          </w:tcPr>
+          <w:p>
+            <w:r>
+              <w:t>101,706</w:t>
+            </w:r>
+          </w:p>
+        </w:tc>
+        <w:tc>
+          <w:tcPr>
+            <w:tcW w:w="1390" w:type="dxa"/>
+          </w:tcPr>
+          <w:p>
+            <w:r>
+              <w:t>127,971</w:t>
+            </w:r>
+          </w:p>
         </w:tc>
         <w:tc>
           <w:tcPr>
             <w:tcW w:w="1154" w:type="dxa"/>
           </w:tcPr>
-          <w:p/>
+          <w:p>
+            <w:r>
+              <w:t>0.6875</w:t>
+            </w:r>
+          </w:p>
         </w:tc>
         <w:tc>
           <w:tcPr>
             <w:tcW w:w="1545" w:type="dxa"/>
           </w:tcPr>
-          <w:p/>
+          <w:p>
+            <w:r>
+              <w:t>+38.23</w:t>
+            </w:r>
+          </w:p>
         </w:tc>
         <w:tc>
           <w:tcPr>
             <w:tcW w:w="2060" w:type="dxa"/>
           </w:tcPr>
-          <w:p/>
+          <w:p>
+            <w:r>
+              <w:t>+12.38</w:t>
+            </w:r>
+          </w:p>
         </w:tc>
       </w:tr>
       <w:tr>
@@ -5737,55 +6314,91 @@
           <w:tcPr>
             <w:tcW w:w="1283" w:type="dxa"/>
           </w:tcPr>
-          <w:p/>
+          <w:p>
+            <w:r>
+              <w:t>70.84</w:t>
+            </w:r>
+          </w:p>
         </w:tc>
         <w:tc>
           <w:tcPr>
             <w:tcW w:w="1183" w:type="dxa"/>
           </w:tcPr>
-          <w:p/>
+          <w:p>
+            <w:r>
+              <w:t>9.12</w:t>
+            </w:r>
+          </w:p>
         </w:tc>
         <w:tc>
           <w:tcPr>
             <w:tcW w:w="1207" w:type="dxa"/>
           </w:tcPr>
-          <w:p/>
+          <w:p>
+            <w:r>
+              <w:t>8.98</w:t>
+            </w:r>
+          </w:p>
         </w:tc>
         <w:tc>
           <w:tcPr>
             <w:tcW w:w="1240" w:type="dxa"/>
           </w:tcPr>
-          <w:p/>
-        </w:tc>
-        <w:tc>
-          <w:tcPr>
-            <w:tcW w:w="1390" w:type="dxa"/>
-          </w:tcPr>
-          <w:p/>
-        </w:tc>
-        <w:tc>
-          <w:tcPr>
-            <w:tcW w:w="1390" w:type="dxa"/>
-          </w:tcPr>
-          <w:p/>
+          <w:p>
+            <w:r>
+              <w:t>11.05</w:t>
+            </w:r>
+          </w:p>
+        </w:tc>
+        <w:tc>
+          <w:tcPr>
+            <w:tcW w:w="1390" w:type="dxa"/>
+          </w:tcPr>
+          <w:p>
+            <w:r>
+              <w:t>112,769</w:t>
+            </w:r>
+          </w:p>
+        </w:tc>
+        <w:tc>
+          <w:tcPr>
+            <w:tcW w:w="1390" w:type="dxa"/>
+          </w:tcPr>
+          <w:p>
+            <w:r>
+              <w:t>138,724</w:t>
+            </w:r>
+          </w:p>
         </w:tc>
         <w:tc>
           <w:tcPr>
             <w:tcW w:w="1154" w:type="dxa"/>
           </w:tcPr>
-          <w:p/>
+          <w:p>
+            <w:r>
+              <w:t>0.6328</w:t>
+            </w:r>
+          </w:p>
         </w:tc>
         <w:tc>
           <w:tcPr>
             <w:tcW w:w="1545" w:type="dxa"/>
           </w:tcPr>
-          <w:p/>
+          <w:p>
+            <w:r>
+              <w:t>+35.85</w:t>
+            </w:r>
+          </w:p>
         </w:tc>
         <w:tc>
           <w:tcPr>
             <w:tcW w:w="2060" w:type="dxa"/>
           </w:tcPr>
-          <w:p/>
+          <w:p>
+            <w:r>
+              <w:t>+11.75</w:t>
+            </w:r>
+          </w:p>
         </w:tc>
       </w:tr>
       <w:tr>
@@ -5803,55 +6416,91 @@
           <w:tcPr>
             <w:tcW w:w="1283" w:type="dxa"/>
           </w:tcPr>
-          <w:p/>
+          <w:p>
+            <w:r>
+              <w:t>73.03</w:t>
+            </w:r>
+          </w:p>
         </w:tc>
         <w:tc>
           <w:tcPr>
             <w:tcW w:w="1183" w:type="dxa"/>
           </w:tcPr>
-          <w:p/>
+          <w:p>
+            <w:r>
+              <w:t>8.47</w:t>
+            </w:r>
+          </w:p>
         </w:tc>
         <w:tc>
           <w:tcPr>
             <w:tcW w:w="1207" w:type="dxa"/>
           </w:tcPr>
-          <w:p/>
+          <w:p>
+            <w:r>
+              <w:t>8.26</w:t>
+            </w:r>
+          </w:p>
         </w:tc>
         <w:tc>
           <w:tcPr>
             <w:tcW w:w="1240" w:type="dxa"/>
           </w:tcPr>
-          <w:p/>
-        </w:tc>
-        <w:tc>
-          <w:tcPr>
-            <w:tcW w:w="1390" w:type="dxa"/>
-          </w:tcPr>
-          <w:p/>
-        </w:tc>
-        <w:tc>
-          <w:tcPr>
-            <w:tcW w:w="1390" w:type="dxa"/>
-          </w:tcPr>
-          <w:p/>
+          <w:p>
+            <w:r>
+              <w:t>10.23</w:t>
+            </w:r>
+          </w:p>
+        </w:tc>
+        <w:tc>
+          <w:tcPr>
+            <w:tcW w:w="1390" w:type="dxa"/>
+          </w:tcPr>
+          <w:p>
+            <w:r>
+              <w:t>103,711</w:t>
+            </w:r>
+          </w:p>
+        </w:tc>
+        <w:tc>
+          <w:tcPr>
+            <w:tcW w:w="1390" w:type="dxa"/>
+          </w:tcPr>
+          <w:p>
+            <w:r>
+              <w:t>128,472</w:t>
+            </w:r>
+          </w:p>
         </w:tc>
         <w:tc>
           <w:tcPr>
             <w:tcW w:w="1154" w:type="dxa"/>
           </w:tcPr>
-          <w:p/>
+          <w:p>
+            <w:r>
+              <w:t>0.6851</w:t>
+            </w:r>
+          </w:p>
         </w:tc>
         <w:tc>
           <w:tcPr>
             <w:tcW w:w="1545" w:type="dxa"/>
           </w:tcPr>
-          <w:p/>
+          <w:p>
+            <w:r>
+              <w:t>+38.05</w:t>
+            </w:r>
+          </w:p>
         </w:tc>
         <w:tc>
           <w:tcPr>
             <w:tcW w:w="2060" w:type="dxa"/>
           </w:tcPr>
-          <w:p/>
+          <w:p>
+            <w:r>
+              <w:t>+12.40</w:t>
+            </w:r>
+          </w:p>
         </w:tc>
       </w:tr>
       <w:tr>
@@ -5869,55 +6518,91 @@
           <w:tcPr>
             <w:tcW w:w="1283" w:type="dxa"/>
           </w:tcPr>
-          <w:p/>
+          <w:p>
+            <w:r>
+              <w:t>74.49</w:t>
+            </w:r>
+          </w:p>
         </w:tc>
         <w:tc>
           <w:tcPr>
             <w:tcW w:w="1183" w:type="dxa"/>
           </w:tcPr>
-          <w:p/>
+          <w:p>
+            <w:r>
+              <w:t>8.03</w:t>
+            </w:r>
+          </w:p>
         </w:tc>
         <w:tc>
           <w:tcPr>
             <w:tcW w:w="1207" w:type="dxa"/>
           </w:tcPr>
-          <w:p/>
+          <w:p>
+            <w:r>
+              <w:t>7.66</w:t>
+            </w:r>
+          </w:p>
         </w:tc>
         <w:tc>
           <w:tcPr>
             <w:tcW w:w="1240" w:type="dxa"/>
           </w:tcPr>
-          <w:p/>
-        </w:tc>
-        <w:tc>
-          <w:tcPr>
-            <w:tcW w:w="1390" w:type="dxa"/>
-          </w:tcPr>
-          <w:p/>
-        </w:tc>
-        <w:tc>
-          <w:tcPr>
-            <w:tcW w:w="1390" w:type="dxa"/>
-          </w:tcPr>
-          <w:p/>
+          <w:p>
+            <w:r>
+              <w:t>9.83</w:t>
+            </w:r>
+          </w:p>
+        </w:tc>
+        <w:tc>
+          <w:tcPr>
+            <w:tcW w:w="1390" w:type="dxa"/>
+          </w:tcPr>
+          <w:p>
+            <w:r>
+              <w:t>96,097</w:t>
+            </w:r>
+          </w:p>
+        </w:tc>
+        <w:tc>
+          <w:tcPr>
+            <w:tcW w:w="1390" w:type="dxa"/>
+          </w:tcPr>
+          <w:p>
+            <w:r>
+              <w:t>123,353</w:t>
+            </w:r>
+          </w:p>
         </w:tc>
         <w:tc>
           <w:tcPr>
             <w:tcW w:w="1154" w:type="dxa"/>
           </w:tcPr>
-          <w:p/>
+          <w:p>
+            <w:r>
+              <w:t>0.7097</w:t>
+            </w:r>
+          </w:p>
         </w:tc>
         <w:tc>
           <w:tcPr>
             <w:tcW w:w="1545" w:type="dxa"/>
           </w:tcPr>
-          <w:p/>
+          <w:p>
+            <w:r>
+              <w:t>+39.50</w:t>
+            </w:r>
+          </w:p>
         </w:tc>
         <w:tc>
           <w:tcPr>
             <w:tcW w:w="2060" w:type="dxa"/>
           </w:tcPr>
-          <w:p/>
+          <w:p>
+            <w:r>
+              <w:t>+12.84</w:t>
+            </w:r>
+          </w:p>
         </w:tc>
       </w:tr>
       <w:tr>
@@ -5935,55 +6620,91 @@
           <w:tcPr>
             <w:tcW w:w="1283" w:type="dxa"/>
           </w:tcPr>
-          <w:p/>
+          <w:p>
+            <w:r>
+              <w:t>70.16</w:t>
+            </w:r>
+          </w:p>
         </w:tc>
         <w:tc>
           <w:tcPr>
             <w:tcW w:w="1183" w:type="dxa"/>
           </w:tcPr>
-          <w:p/>
+          <w:p>
+            <w:r>
+              <w:t>9.43</w:t>
+            </w:r>
+          </w:p>
         </w:tc>
         <w:tc>
           <w:tcPr>
             <w:tcW w:w="1207" w:type="dxa"/>
           </w:tcPr>
-          <w:p/>
+          <w:p>
+            <w:r>
+              <w:t>9.12</w:t>
+            </w:r>
+          </w:p>
         </w:tc>
         <w:tc>
           <w:tcPr>
             <w:tcW w:w="1240" w:type="dxa"/>
           </w:tcPr>
-          <w:p/>
-        </w:tc>
-        <w:tc>
-          <w:tcPr>
-            <w:tcW w:w="1390" w:type="dxa"/>
-          </w:tcPr>
-          <w:p/>
-        </w:tc>
-        <w:tc>
-          <w:tcPr>
-            <w:tcW w:w="1390" w:type="dxa"/>
-          </w:tcPr>
-          <w:p/>
+          <w:p>
+            <w:r>
+              <w:t>11.29</w:t>
+            </w:r>
+          </w:p>
+        </w:tc>
+        <w:tc>
+          <w:tcPr>
+            <w:tcW w:w="1390" w:type="dxa"/>
+          </w:tcPr>
+          <w:p>
+            <w:r>
+              <w:t>114,506</w:t>
+            </w:r>
+          </w:p>
+        </w:tc>
+        <w:tc>
+          <w:tcPr>
+            <w:tcW w:w="1390" w:type="dxa"/>
+          </w:tcPr>
+          <w:p>
+            <w:r>
+              <w:t>141,769</w:t>
+            </w:r>
+          </w:p>
         </w:tc>
         <w:tc>
           <w:tcPr>
             <w:tcW w:w="1154" w:type="dxa"/>
           </w:tcPr>
-          <w:p/>
+          <w:p>
+            <w:r>
+              <w:t>0.6165</w:t>
+            </w:r>
+          </w:p>
         </w:tc>
         <w:tc>
           <w:tcPr>
             <w:tcW w:w="1545" w:type="dxa"/>
           </w:tcPr>
-          <w:p/>
+          <w:p>
+            <w:r>
+              <w:t>+35.17</w:t>
+            </w:r>
+          </w:p>
         </w:tc>
         <w:tc>
           <w:tcPr>
             <w:tcW w:w="2060" w:type="dxa"/>
           </w:tcPr>
-          <w:p/>
+          <w:p>
+            <w:r>
+              <w:t>+11.44</w:t>
+            </w:r>
+          </w:p>
         </w:tc>
       </w:tr>
       <w:tr>
@@ -6001,55 +6722,91 @@
           <w:tcPr>
             <w:tcW w:w="1283" w:type="dxa"/>
           </w:tcPr>
-          <w:p/>
+          <w:p>
+            <w:r>
+              <w:t>73.13</w:t>
+            </w:r>
+          </w:p>
         </w:tc>
         <w:tc>
           <w:tcPr>
             <w:tcW w:w="1183" w:type="dxa"/>
           </w:tcPr>
-          <w:p/>
+          <w:p>
+            <w:r>
+              <w:t>8.47</w:t>
+            </w:r>
+          </w:p>
         </w:tc>
         <w:tc>
           <w:tcPr>
             <w:tcW w:w="1207" w:type="dxa"/>
           </w:tcPr>
-          <w:p/>
+          <w:p>
+            <w:r>
+              <w:t>8.19</w:t>
+            </w:r>
+          </w:p>
         </w:tc>
         <w:tc>
           <w:tcPr>
             <w:tcW w:w="1240" w:type="dxa"/>
           </w:tcPr>
-          <w:p/>
-        </w:tc>
-        <w:tc>
-          <w:tcPr>
-            <w:tcW w:w="1390" w:type="dxa"/>
-          </w:tcPr>
-          <w:p/>
-        </w:tc>
-        <w:tc>
-          <w:tcPr>
-            <w:tcW w:w="1390" w:type="dxa"/>
-          </w:tcPr>
-          <w:p/>
+          <w:p>
+            <w:r>
+              <w:t>10.21</w:t>
+            </w:r>
+          </w:p>
+        </w:tc>
+        <w:tc>
+          <w:tcPr>
+            <w:tcW w:w="1390" w:type="dxa"/>
+          </w:tcPr>
+          <w:p>
+            <w:r>
+              <w:t>102,750</w:t>
+            </w:r>
+          </w:p>
+        </w:tc>
+        <w:tc>
+          <w:tcPr>
+            <w:tcW w:w="1390" w:type="dxa"/>
+          </w:tcPr>
+          <w:p>
+            <w:r>
+              <w:t>128,176</w:t>
+            </w:r>
+          </w:p>
         </w:tc>
         <w:tc>
           <w:tcPr>
             <w:tcW w:w="1154" w:type="dxa"/>
           </w:tcPr>
-          <w:p/>
+          <w:p>
+            <w:r>
+              <w:t>0.6865</w:t>
+            </w:r>
+          </w:p>
         </w:tc>
         <w:tc>
           <w:tcPr>
             <w:tcW w:w="1545" w:type="dxa"/>
           </w:tcPr>
-          <w:p/>
+          <w:p>
+            <w:r>
+              <w:t>+38.15</w:t>
+            </w:r>
+          </w:p>
         </w:tc>
         <w:tc>
           <w:tcPr>
             <w:tcW w:w="2060" w:type="dxa"/>
           </w:tcPr>
-          <w:p/>
+          <w:p>
+            <w:r>
+              <w:t>+12.40</w:t>
+            </w:r>
+          </w:p>
         </w:tc>
       </w:tr>
     </w:tbl>
@@ -6090,13 +6847,7 @@
             </w:pPr>
             <w:r>
               <w:lastRenderedPageBreak/>
-              <w:t xml:space="preserve">Lookback Window (Days): </w:t>
-            </w:r>
-            <w:r>
-              <w:t>56</w:t>
-            </w:r>
-            <w:r>
-              <w:t xml:space="preserve">; Forecast Horizon (Days): 7; </w:t>
+              <w:t xml:space="preserve">Lookback Window (Days): 56; Forecast Horizon (Days): 7; </w:t>
             </w:r>
             <w:r>
               <w:rPr>
@@ -6898,13 +7649,7 @@
               <w:jc w:val="center"/>
             </w:pPr>
             <w:r>
-              <w:t xml:space="preserve">Lookback Window (Days): </w:t>
-            </w:r>
-            <w:r>
-              <w:t>56</w:t>
-            </w:r>
-            <w:r>
-              <w:t xml:space="preserve">; Forecast Horizon (Days): 7; </w:t>
+              <w:t xml:space="preserve">Lookback Window (Days): 56; Forecast Horizon (Days): 7; </w:t>
             </w:r>
             <w:r>
               <w:rPr>

</xml_diff>